<commit_message>
v1.0.17 post-release CONTINUATION sync — §3.17 marked DONE/RELEASED (GitHub + GitLab releases live), §1 snapshot version 1.0.14→1.0.17. Closes the cycle: both user-reported bugs fixed + dual-host validated + released.
Signed-off-by: Milos Vasic <i@mvasic.ru>
</commit_message>
<xml_diff>
--- a/CONTINUATION.docx
+++ b/CONTINUATION.docx
@@ -10,7 +10,7 @@
         <w:t xml:space="preserve">CONTINUATION</w:t>
       </w:r>
     </w:p>
-    <w:bookmarkStart w:id="33" w:name="continuationmd--vasic-digital-tmux"/>
+    <w:bookmarkStart w:id="35" w:name="continuationmd--vasic-digital-tmux"/>
     <w:p>
       <w:pPr>
         <w:pStyle w:val="Heading1"/>
@@ -34,7 +34,7 @@
         <w:t xml:space="preserve"> </w:t>
       </w:r>
       <w:r>
-        <w:t xml:space="preserve">2026-05-29T11:30Z</w:t>
+        <w:t xml:space="preserve">2026-05-29T12:10Z</w:t>
       </w:r>
     </w:p>
     <w:bookmarkStart w:id="9" w:name="X46e2b1e0ed863e0637bb3aab0aa22fad9aaafec"/>
@@ -339,13 +339,58 @@
                 <w:b/>
                 <w:bCs/>
               </w:rPr>
-              <w:t xml:space="preserve">1.0.14</w:t>
+              <w:t xml:space="preserve">1.0.17</w:t>
             </w:r>
             <w:r>
               <w:t xml:space="preserve"> </w:t>
             </w:r>
             <w:r>
-              <w:t xml:space="preserve">(versionCode 15) — A35 clipboard copy-OUT physical proof (test 44 + M44 + TMUX-CH-44 + verify.sh Layer-1 extension) + A36 e2e stale-podman-prereq fix + B3 P5 escape transparency; multi-host deploy (Mistborn + nezha), 2026-05-22</w:t>
+              <w:t xml:space="preserve">(versionCode 18) — A41 bash-login double session-name prompt fixed (per-process</w:t>
+            </w:r>
+            <w:r>
+              <w:t xml:space="preserve"> </w:t>
+            </w:r>
+            <w:r>
+              <w:rPr>
+                <w:rStyle w:val="VerbatimChar"/>
+              </w:rPr>
+              <w:t xml:space="preserve">_TMX_SHELL_INIT_PROMPTED</w:t>
+            </w:r>
+            <w:r>
+              <w:t xml:space="preserve"> </w:t>
+            </w:r>
+            <w:r>
+              <w:t xml:space="preserve">guard; nezha real-HOME</w:t>
+            </w:r>
+            <w:r>
+              <w:t xml:space="preserve"> </w:t>
+            </w:r>
+            <w:r>
+              <w:rPr>
+                <w:rStyle w:val="VerbatimChar"/>
+              </w:rPr>
+              <w:t xml:space="preserve">bash -l -i</w:t>
+            </w:r>
+            <w:r>
+              <w:t xml:space="preserve"> </w:t>
+            </w:r>
+            <w:r>
+              <w:t xml:space="preserve">2→1) + A42 mouse select/copy</w:t>
+            </w:r>
+            <w:r>
+              <w:t xml:space="preserve"> </w:t>
+            </w:r>
+            <w:r>
+              <w:rPr>
+                <w:rStyle w:val="VerbatimChar"/>
+              </w:rPr>
+              <w:t xml:space="preserve">prefix m</w:t>
+            </w:r>
+            <w:r>
+              <w:t xml:space="preserve"> </w:t>
+            </w:r>
+            <w:r>
+              <w:t xml:space="preserve">toggle (terminal-agnostic native-selection escape hatch for Claude Code) + B3 P5-M20/M21 escapes closed &amp; migrated to Fixed.md (meta 47 caught/0 escaped). Dual-host deploy GREEN (Mistborn + nezha), 2026-05-29. Released on GitHub + GitLab.</w:t>
             </w:r>
           </w:p>
         </w:tc>
@@ -885,7 +930,7 @@
       </w:r>
     </w:p>
     <w:bookmarkEnd w:id="11"/>
-    <w:bookmarkStart w:id="30" w:name="X9bbd2c3048cfbd7ee7622f0d2295634d9b66aad"/>
+    <w:bookmarkStart w:id="32" w:name="X9bbd2c3048cfbd7ee7622f0d2295634d9b66aad"/>
     <w:p>
       <w:pPr>
         <w:pStyle w:val="Heading2"/>
@@ -894,7 +939,7 @@
         <w:t xml:space="preserve">§3 — Active work</w:t>
       </w:r>
     </w:p>
-    <w:bookmarkStart w:id="12" w:name="Xebab2c91518890b5812c0749bb46435dd248681"/>
+    <w:bookmarkStart w:id="14" w:name="Xebab2c91518890b5812c0749bb46435dd248681"/>
     <w:p>
       <w:pPr>
         <w:pStyle w:val="Heading3"/>
@@ -918,7 +963,38 @@
         <w:t xml:space="preserve"> </w:t>
       </w:r>
       <w:r>
-        <w:t xml:space="preserve">IN PROGRESS (fixes + Mistborn validation done; dual-host setup + release pending).</w:t>
+        <w:t xml:space="preserve">DONE — RELEASED v1.0.17 (2026-05-29). GitHub:</w:t>
+      </w:r>
+      <w:r>
+        <w:t xml:space="preserve"> </w:t>
+      </w:r>
+      <w:hyperlink r:id="rId12">
+        <w:r>
+          <w:rPr>
+            <w:rStyle w:val="Hyperlink"/>
+          </w:rPr>
+          <w:t xml:space="preserve">https://github.com/vasic-digital/tmux/releases/tag/v1.0.17</w:t>
+        </w:r>
+      </w:hyperlink>
+      <w:r>
+        <w:t xml:space="preserve"> </w:t>
+      </w:r>
+      <w:r>
+        <w:t xml:space="preserve">· GitLab:</w:t>
+      </w:r>
+      <w:r>
+        <w:t xml:space="preserve"> </w:t>
+      </w:r>
+      <w:hyperlink r:id="rId13">
+        <w:r>
+          <w:rPr>
+            <w:rStyle w:val="Hyperlink"/>
+          </w:rPr>
+          <w:t xml:space="preserve">https://gitlab.com/vasic-digital/tmux/-/releases/v1.0.17</w:t>
+        </w:r>
+      </w:hyperlink>
+      <w:r>
+        <w:t xml:space="preserve">. Dual-host setup GREEN (Mistborn suite 51/0/4 + meta 47/0; nezha 43/0/12, double-prompt real-HOME 2→1). CodeGraph 0.9.7 validate PASS both hosts. Commits 1de20c5 → a6a81df → bbb1467.</w:t>
       </w:r>
     </w:p>
     <w:p>
@@ -1375,8 +1451,8 @@
         <w:t xml:space="preserve">both-host evidence, VERSION bump (1.0.17/18), gh+glab release.</w:t>
       </w:r>
     </w:p>
-    <w:bookmarkEnd w:id="12"/>
-    <w:bookmarkStart w:id="13" w:name="X4bf7be095085477ec4195c5ea33259b03408111"/>
+    <w:bookmarkEnd w:id="14"/>
+    <w:bookmarkStart w:id="15" w:name="X4bf7be095085477ec4195c5ea33259b03408111"/>
     <w:p>
       <w:pPr>
         <w:pStyle w:val="Heading3"/>
@@ -1691,8 +1767,8 @@
         <w:t xml:space="preserve">to carry every numbered anchor + canonical-authority cross-references</w:t>
       </w:r>
     </w:p>
-    <w:bookmarkEnd w:id="13"/>
-    <w:bookmarkStart w:id="14" w:name="X9597a4ec2f18a9b28ff1f606dbcb4fc46cb4e4b"/>
+    <w:bookmarkEnd w:id="15"/>
+    <w:bookmarkStart w:id="16" w:name="X9597a4ec2f18a9b28ff1f606dbcb4fc46cb4e4b"/>
     <w:p>
       <w:pPr>
         <w:pStyle w:val="Heading3"/>
@@ -2055,8 +2131,8 @@
         <w:t xml:space="preserve">3 concurrent scopes, all registered + active simultaneously ✓</w:t>
       </w:r>
     </w:p>
-    <w:bookmarkEnd w:id="14"/>
-    <w:bookmarkStart w:id="15" w:name="X06cb01c5625e5cfa81a37477bd54d4d45671fdf"/>
+    <w:bookmarkEnd w:id="16"/>
+    <w:bookmarkStart w:id="17" w:name="X06cb01c5625e5cfa81a37477bd54d4d45671fdf"/>
     <w:p>
       <w:pPr>
         <w:pStyle w:val="Heading3"/>
@@ -2237,8 +2313,8 @@
         <w:t xml:space="preserve">— Issues.md D1 (formal topology dispatch matrix)</w:t>
       </w:r>
     </w:p>
-    <w:bookmarkEnd w:id="15"/>
-    <w:bookmarkStart w:id="16" w:name="X6dbba4eb95812a90f20c800e44eb5a6a7358d51"/>
+    <w:bookmarkEnd w:id="17"/>
+    <w:bookmarkStart w:id="18" w:name="X6dbba4eb95812a90f20c800e44eb5a6a7358d51"/>
     <w:p>
       <w:pPr>
         <w:pStyle w:val="Heading3"/>
@@ -2586,8 +2662,8 @@
         <w:t xml:space="preserve">B2.</w:t>
       </w:r>
     </w:p>
-    <w:bookmarkEnd w:id="16"/>
-    <w:bookmarkStart w:id="17" w:name="Xb35b1f3f7dabbb428c448451ce7167cbe2cd4e6"/>
+    <w:bookmarkEnd w:id="18"/>
+    <w:bookmarkStart w:id="19" w:name="Xb35b1f3f7dabbb428c448451ce7167cbe2cd4e6"/>
     <w:p>
       <w:pPr>
         <w:pStyle w:val="Heading3"/>
@@ -2917,8 +2993,8 @@
         <w:t xml:space="preserve">— bump test count from 9 to 11.</w:t>
       </w:r>
     </w:p>
-    <w:bookmarkEnd w:id="17"/>
-    <w:bookmarkStart w:id="18" w:name="X2dea41730e11114ce2f1f24a9ac20830f0c6d8c"/>
+    <w:bookmarkEnd w:id="19"/>
+    <w:bookmarkStart w:id="20" w:name="X2dea41730e11114ce2f1f24a9ac20830f0c6d8c"/>
     <w:p>
       <w:pPr>
         <w:pStyle w:val="Heading3"/>
@@ -3244,8 +3320,8 @@
         <w:t xml:space="preserve">: B1 (CHAL-COVER-001), C1 (TMX-T5), C2 (TMX-T7), C3 (TMX-T8), D1 (TOPO-DISPATCH-001) moved to Fixed.md.</w:t>
       </w:r>
     </w:p>
-    <w:bookmarkEnd w:id="18"/>
-    <w:bookmarkStart w:id="20" w:name="Xa47a1f2e6aab857c5ebcc9727ef871a96653e0e"/>
+    <w:bookmarkEnd w:id="20"/>
+    <w:bookmarkStart w:id="22" w:name="Xa47a1f2e6aab857c5ebcc9727ef871a96653e0e"/>
     <w:p>
       <w:pPr>
         <w:pStyle w:val="Heading3"/>
@@ -4205,7 +4281,7 @@
       <w:r>
         <w:t xml:space="preserve"> </w:t>
       </w:r>
-      <w:hyperlink r:id="rId19">
+      <w:hyperlink r:id="rId21">
         <w:r>
           <w:rPr>
             <w:rStyle w:val="VerbatimChar"/>
@@ -6721,8 +6797,8 @@
         <w:t xml:space="preserve">itself is a §12.10 / §11.4.6 violation — opaque commit message, silent submodule mutation, no CONTINUATION update. Cannot rewrite history per §9 data safety; documenting here is the audit trail.</w:t>
       </w:r>
     </w:p>
-    <w:bookmarkEnd w:id="20"/>
-    <w:bookmarkStart w:id="21" w:name="X39a6c66e0be7f50e7d32ecd13d50cf753d128a7"/>
+    <w:bookmarkEnd w:id="22"/>
+    <w:bookmarkStart w:id="23" w:name="X39a6c66e0be7f50e7d32ecd13d50cf753d128a7"/>
     <w:p>
       <w:pPr>
         <w:pStyle w:val="Heading3"/>
@@ -7056,8 +7132,8 @@
         <w:t xml:space="preserve">§3.6: removed stale "remaining open" note.</w:t>
       </w:r>
     </w:p>
-    <w:bookmarkEnd w:id="21"/>
-    <w:bookmarkStart w:id="22" w:name="X2726eb1fde9d0d5c4232a8af5bb29bc2efcb6ea"/>
+    <w:bookmarkEnd w:id="23"/>
+    <w:bookmarkStart w:id="24" w:name="X2726eb1fde9d0d5c4232a8af5bb29bc2efcb6ea"/>
     <w:p>
       <w:pPr>
         <w:pStyle w:val="Heading3"/>
@@ -8032,8 +8108,8 @@
         <w:t xml:space="preserve">all work").</w:t>
       </w:r>
     </w:p>
-    <w:bookmarkEnd w:id="22"/>
-    <w:bookmarkStart w:id="23" w:name="X50530f0d3163508b53d4e1446abd0230469972a"/>
+    <w:bookmarkEnd w:id="24"/>
+    <w:bookmarkStart w:id="25" w:name="X50530f0d3163508b53d4e1446abd0230469972a"/>
     <w:p>
       <w:pPr>
         <w:pStyle w:val="Heading3"/>
@@ -8761,8 +8837,8 @@
         <w:t xml:space="preserve">headless).</w:t>
       </w:r>
     </w:p>
-    <w:bookmarkEnd w:id="23"/>
-    <w:bookmarkStart w:id="24" w:name="Xb6dc7ed3ec66a5d998e26a7e8534471ca2cc3e0"/>
+    <w:bookmarkEnd w:id="25"/>
+    <w:bookmarkStart w:id="26" w:name="Xb6dc7ed3ec66a5d998e26a7e8534471ca2cc3e0"/>
     <w:p>
       <w:pPr>
         <w:pStyle w:val="Heading3"/>
@@ -9202,8 +9278,8 @@
         <w:t xml:space="preserve">"Make sure we setup the new version once all done." directive.</w:t>
       </w:r>
     </w:p>
-    <w:bookmarkEnd w:id="24"/>
-    <w:bookmarkStart w:id="25" w:name="Xd3af410912ca3cafb170fb407cc411bb8aa2631"/>
+    <w:bookmarkEnd w:id="26"/>
+    <w:bookmarkStart w:id="27" w:name="Xd3af410912ca3cafb170fb407cc411bb8aa2631"/>
     <w:p>
       <w:pPr>
         <w:pStyle w:val="Heading3"/>
@@ -9626,8 +9702,8 @@
         <w:t xml:space="preserve">as deferred post-release smoke.</w:t>
       </w:r>
     </w:p>
-    <w:bookmarkEnd w:id="25"/>
-    <w:bookmarkStart w:id="26" w:name="Xd334663f66da9fbc338b039ddad8ed42ad07243"/>
+    <w:bookmarkEnd w:id="27"/>
+    <w:bookmarkStart w:id="28" w:name="Xd334663f66da9fbc338b039ddad8ed42ad07243"/>
     <w:p>
       <w:pPr>
         <w:pStyle w:val="Heading3"/>
@@ -10104,8 +10180,8 @@
         <w:t xml:space="preserve">preceded the tag; no spot-check shortcut).</w:t>
       </w:r>
     </w:p>
-    <w:bookmarkEnd w:id="26"/>
-    <w:bookmarkStart w:id="27" w:name="Xd55c57cd252c85ec7bdcd4b23e73cec6cfc2cd4"/>
+    <w:bookmarkEnd w:id="28"/>
+    <w:bookmarkStart w:id="29" w:name="Xd55c57cd252c85ec7bdcd4b23e73cec6cfc2cd4"/>
     <w:p>
       <w:pPr>
         <w:pStyle w:val="Heading3"/>
@@ -11176,8 +11252,8 @@
         <w:t xml:space="preserve">tests 09/13/14 alongside the Darwin branches running today.</w:t>
       </w:r>
     </w:p>
-    <w:bookmarkEnd w:id="27"/>
-    <w:bookmarkStart w:id="28" w:name="X572a5be484f72dd1209250eb21ec3b6cad7931d"/>
+    <w:bookmarkEnd w:id="29"/>
+    <w:bookmarkStart w:id="30" w:name="X572a5be484f72dd1209250eb21ec3b6cad7931d"/>
     <w:p>
       <w:pPr>
         <w:pStyle w:val="Heading3"/>
@@ -12125,8 +12201,8 @@
         <w:t xml:space="preserve">topology-correct), e2e 9/0/0.</w:t>
       </w:r>
     </w:p>
-    <w:bookmarkEnd w:id="28"/>
-    <w:bookmarkStart w:id="29" w:name="Xdc1f843cc4a7cc6c48cb008be32d2d72d9f426c"/>
+    <w:bookmarkEnd w:id="30"/>
+    <w:bookmarkStart w:id="31" w:name="Xdc1f843cc4a7cc6c48cb008be32d2d72d9f426c"/>
     <w:p>
       <w:pPr>
         <w:pStyle w:val="Heading3"/>
@@ -12735,9 +12811,9 @@
         <w:t xml:space="preserve">GREEN, suite PASS=13/0/SKIP=5, meta-test 18/0/6, e2e 9/0/0.</w:t>
       </w:r>
     </w:p>
-    <w:bookmarkEnd w:id="29"/>
-    <w:bookmarkEnd w:id="30"/>
-    <w:bookmarkStart w:id="31" w:name="Xf9daad60751079e769ca58715403a214307050f"/>
+    <w:bookmarkEnd w:id="31"/>
+    <w:bookmarkEnd w:id="32"/>
+    <w:bookmarkStart w:id="33" w:name="Xf9daad60751079e769ca58715403a214307050f"/>
     <w:p>
       <w:pPr>
         <w:pStyle w:val="Heading2"/>
@@ -13379,8 +13455,8 @@
         <w:t xml:space="preserve">(2026-05-07) — Initial vasic-digital/tmux: migrated from ATMOSphere project + per-session containerization plan + 8-test verification gate.</w:t>
       </w:r>
     </w:p>
-    <w:bookmarkEnd w:id="31"/>
-    <w:bookmarkStart w:id="32" w:name="X6eb44e94951e80621b9fe10f2f53b34d95aee13"/>
+    <w:bookmarkEnd w:id="33"/>
+    <w:bookmarkStart w:id="34" w:name="X6eb44e94951e80621b9fe10f2f53b34d95aee13"/>
     <w:p>
       <w:pPr>
         <w:pStyle w:val="Heading2"/>
@@ -13509,8 +13585,8 @@
         <w:t xml:space="preserve">Update this document in the SAME commit as the work itself (§12.10 invariant)</w:t>
       </w:r>
     </w:p>
-    <w:bookmarkEnd w:id="32"/>
-    <w:bookmarkEnd w:id="33"/>
+    <w:bookmarkEnd w:id="34"/>
+    <w:bookmarkEnd w:id="35"/>
     <w:sectPr>
       <w:footnotePr>
         <w:numRestart w:val="eachSect"/>

</xml_diff>

<commit_message>
v1.0.18 release — plain mouse-drag selects+copies in mouse-tracking apps (Claude Code), the real fix completing A42. VERSION 1.0.18/19. Real-mouse proven: headless SGR drag (test 56, cross-platform, regression-discriminating, 3/3) + cliclick GUI drag over iTerm2 (macOS). Meta 48 caught/0 escaped incl M-PLAINDRAG; suite 51/0/4. CHANGELOG + docs/changelogs/v1.0.18.md + CONTINUATION §3.18. Sources verified 2026-05-29: https://man.openbsd.org/tmux.1.
Signed-off-by: Milos Vasic <i@mvasic.ru>
</commit_message>
<xml_diff>
--- a/CONTINUATION.docx
+++ b/CONTINUATION.docx
@@ -10,7 +10,7 @@
         <w:t xml:space="preserve">CONTINUATION</w:t>
       </w:r>
     </w:p>
-    <w:bookmarkStart w:id="35" w:name="continuationmd--vasic-digital-tmux"/>
+    <w:bookmarkStart w:id="36" w:name="continuationmd--vasic-digital-tmux"/>
     <w:p>
       <w:pPr>
         <w:pStyle w:val="Heading1"/>
@@ -34,7 +34,7 @@
         <w:t xml:space="preserve"> </w:t>
       </w:r>
       <w:r>
-        <w:t xml:space="preserve">2026-05-29T12:10Z</w:t>
+        <w:t xml:space="preserve">2026-05-29T12:30Z</w:t>
       </w:r>
     </w:p>
     <w:bookmarkStart w:id="9" w:name="X46e2b1e0ed863e0637bb3aab0aa22fad9aaafec"/>
@@ -930,7 +930,7 @@
       </w:r>
     </w:p>
     <w:bookmarkEnd w:id="11"/>
-    <w:bookmarkStart w:id="32" w:name="X9bbd2c3048cfbd7ee7622f0d2295634d9b66aad"/>
+    <w:bookmarkStart w:id="33" w:name="X9bbd2c3048cfbd7ee7622f0d2295634d9b66aad"/>
     <w:p>
       <w:pPr>
         <w:pStyle w:val="Heading2"/>
@@ -939,12 +939,250 @@
         <w:t xml:space="preserve">§3 — Active work</w:t>
       </w:r>
     </w:p>
-    <w:bookmarkStart w:id="14" w:name="Xebab2c91518890b5812c0749bb46435dd248681"/>
+    <w:bookmarkStart w:id="12" w:name="X355fc9a1cf777007644228a932aa130e2c8e704"/>
     <w:p>
       <w:pPr>
         <w:pStyle w:val="Heading3"/>
       </w:pPr>
       <w:r>
+        <w:t xml:space="preserve">§3.18 — v1.0.18 REAL mouse-copy fix: plain drag selects+copies in Claude Code, proven with a real mouse (2026-05-29)</w:t>
+      </w:r>
+    </w:p>
+    <w:p>
+      <w:pPr>
+        <w:pStyle w:val="FirstParagraph"/>
+      </w:pPr>
+      <w:r>
+        <w:rPr>
+          <w:b/>
+          <w:bCs/>
+        </w:rPr>
+        <w:t xml:space="preserve">Status:</w:t>
+      </w:r>
+      <w:r>
+        <w:t xml:space="preserve"> </w:t>
+      </w:r>
+      <w:r>
+        <w:t xml:space="preserve">IN PROGRESS (fix + Mistborn proof done; dual-host setup + release pending).</w:t>
+      </w:r>
+    </w:p>
+    <w:p>
+      <w:pPr>
+        <w:pStyle w:val="BodyText"/>
+      </w:pPr>
+      <w:r>
+        <w:t xml:space="preserve">Operator re-reported that select+copy still failed in Claude Code and demanded</w:t>
+      </w:r>
+      <w:r>
+        <w:t xml:space="preserve"> </w:t>
+      </w:r>
+      <w:r>
+        <w:t xml:space="preserve">it work on BOTH Linux + macOS. The v1.0.17</w:t>
+      </w:r>
+      <w:r>
+        <w:t xml:space="preserve"> </w:t>
+      </w:r>
+      <w:r>
+        <w:rPr>
+          <w:rStyle w:val="VerbatimChar"/>
+        </w:rPr>
+        <w:t xml:space="preserve">prefix m</w:t>
+      </w:r>
+      <w:r>
+        <w:t xml:space="preserve"> </w:t>
+      </w:r>
+      <w:r>
+        <w:t xml:space="preserve">toggle was insufficient</w:t>
+      </w:r>
+      <w:r>
+        <w:t xml:space="preserve"> </w:t>
+      </w:r>
+      <w:r>
+        <w:t xml:space="preserve">(required a magic keystroke). Root cause reproduced with a REAL mouse: in a</w:t>
+      </w:r>
+      <w:r>
+        <w:t xml:space="preserve"> </w:t>
+      </w:r>
+      <w:r>
+        <w:t xml:space="preserve">mouse-tracking app (</w:t>
+      </w:r>
+      <w:r>
+        <w:rPr>
+          <w:rStyle w:val="VerbatimChar"/>
+        </w:rPr>
+        <w:t xml:space="preserve">mouse_any_flag=1</w:t>
+      </w:r>
+      <w:r>
+        <w:t xml:space="preserve">) tmux's built-in root</w:t>
+      </w:r>
+      <w:r>
+        <w:t xml:space="preserve"> </w:t>
+      </w:r>
+      <w:r>
+        <w:rPr>
+          <w:rStyle w:val="VerbatimChar"/>
+        </w:rPr>
+        <w:t xml:space="preserve">MouseDrag1Pane</w:t>
+      </w:r>
+      <w:r>
+        <w:t xml:space="preserve"> </w:t>
+      </w:r>
+      <w:r>
+        <w:t xml:space="preserve">forwards the drag to the app → no selection.</w:t>
+      </w:r>
+      <w:r>
+        <w:t xml:space="preserve"> </w:t>
+      </w:r>
+      <w:r>
+        <w:rPr>
+          <w:b/>
+          <w:bCs/>
+        </w:rPr>
+        <w:t xml:space="preserve">Fix:</w:t>
+      </w:r>
+      <w:r>
+        <w:t xml:space="preserve"> </w:t>
+      </w:r>
+      <w:r>
+        <w:t xml:space="preserve">override</w:t>
+      </w:r>
+      <w:r>
+        <w:t xml:space="preserve"> </w:t>
+      </w:r>
+      <w:r>
+        <w:rPr>
+          <w:rStyle w:val="VerbatimChar"/>
+        </w:rPr>
+        <w:t xml:space="preserve">bind -n MouseDrag1Pane if -F '#{pane_in_mode}' 'send -M' 'copy-mode -M'</w:t>
+      </w:r>
+      <w:r>
+        <w:t xml:space="preserve"> </w:t>
+      </w:r>
+      <w:r>
+        <w:t xml:space="preserve">in</w:t>
+      </w:r>
+      <w:r>
+        <w:t xml:space="preserve"> </w:t>
+      </w:r>
+      <w:r>
+        <w:rPr>
+          <w:rStyle w:val="VerbatimChar"/>
+        </w:rPr>
+        <w:t xml:space="preserve">scripts/tmux.conf.template</w:t>
+      </w:r>
+      <w:r>
+        <w:t xml:space="preserve"> </w:t>
+      </w:r>
+      <w:r>
+        <w:t xml:space="preserve">— plain drag always enters copy-mode + copies on</w:t>
+      </w:r>
+      <w:r>
+        <w:t xml:space="preserve"> </w:t>
+      </w:r>
+      <w:r>
+        <w:t xml:space="preserve">release; click+wheel still reach the app; no terminal-specific modifier</w:t>
+      </w:r>
+      <w:r>
+        <w:t xml:space="preserve"> </w:t>
+      </w:r>
+      <w:r>
+        <w:t xml:space="preserve">(works Linux + macOS). PROVEN with a real mouse: headless SGR-1006 drag</w:t>
+      </w:r>
+      <w:r>
+        <w:t xml:space="preserve"> </w:t>
+      </w:r>
+      <w:r>
+        <w:t xml:space="preserve">injection (mouse_any_flag=1) → @clip sink, regression-discriminating, 3/3</w:t>
+      </w:r>
+      <w:r>
+        <w:t xml:space="preserve"> </w:t>
+      </w:r>
+      <w:r>
+        <w:t xml:space="preserve">(test 56, cross-platform); + real</w:t>
+      </w:r>
+      <w:r>
+        <w:t xml:space="preserve"> </w:t>
+      </w:r>
+      <w:r>
+        <w:rPr>
+          <w:rStyle w:val="VerbatimChar"/>
+        </w:rPr>
+        <w:t xml:space="preserve">cliclick</w:t>
+      </w:r>
+      <w:r>
+        <w:t xml:space="preserve"> </w:t>
+      </w:r>
+      <w:r>
+        <w:t xml:space="preserve">cursor drag over iTerm2 →</w:t>
+      </w:r>
+      <w:r>
+        <w:t xml:space="preserve"> </w:t>
+      </w:r>
+      <w:r>
+        <w:rPr>
+          <w:rStyle w:val="VerbatimChar"/>
+        </w:rPr>
+        <w:t xml:space="preserve">pbpaste</w:t>
+      </w:r>
+      <w:r>
+        <w:t xml:space="preserve"> </w:t>
+      </w:r>
+      <w:r>
+        <w:t xml:space="preserve">(macOS GUI layer). Meta-test</w:t>
+      </w:r>
+      <w:r>
+        <w:t xml:space="preserve"> </w:t>
+      </w:r>
+      <w:r>
+        <w:rPr>
+          <w:rStyle w:val="VerbatimChar"/>
+        </w:rPr>
+        <w:t xml:space="preserve">M-PLAINDRAG</w:t>
+      </w:r>
+      <w:r>
+        <w:t xml:space="preserve"> </w:t>
+      </w:r>
+      <w:r>
+        <w:t xml:space="preserve">CAUGHT; meta</w:t>
+      </w:r>
+      <w:r>
+        <w:t xml:space="preserve"> </w:t>
+      </w:r>
+      <w:r>
+        <w:rPr>
+          <w:rStyle w:val="VerbatimChar"/>
+        </w:rPr>
+        <w:t xml:space="preserve">48 caught / 0 escaped</w:t>
+      </w:r>
+      <w:r>
+        <w:t xml:space="preserve">; suite</w:t>
+      </w:r>
+      <w:r>
+        <w:t xml:space="preserve"> </w:t>
+      </w:r>
+      <w:r>
+        <w:rPr>
+          <w:rStyle w:val="VerbatimChar"/>
+        </w:rPr>
+        <w:t xml:space="preserve">51/0/4</w:t>
+      </w:r>
+      <w:r>
+        <w:t xml:space="preserve">. Commit 5c667cc. Pending: dual-host setup.sh</w:t>
+      </w:r>
+      <w:r>
+        <w:t xml:space="preserve"> </w:t>
+      </w:r>
+      <w:r>
+        <w:t xml:space="preserve">(refresh ~/.tmux.conf), nezha headless test-56 proof, v1.0.18 release.</w:t>
+      </w:r>
+    </w:p>
+    <w:bookmarkEnd w:id="12"/>
+    <w:bookmarkStart w:id="15" w:name="Xebab2c91518890b5812c0749bb46435dd248681"/>
+    <w:p>
+      <w:pPr>
+        <w:pStyle w:val="Heading3"/>
+      </w:pPr>
+      <w:r>
         <w:t xml:space="preserve">§3.17 — v1.0.17 two user-reported bug fixes + B3 closure + dual-host re-validation (2026-05-29)</w:t>
       </w:r>
     </w:p>
@@ -968,7 +1206,7 @@
       <w:r>
         <w:t xml:space="preserve"> </w:t>
       </w:r>
-      <w:hyperlink r:id="rId12">
+      <w:hyperlink r:id="rId13">
         <w:r>
           <w:rPr>
             <w:rStyle w:val="Hyperlink"/>
@@ -985,7 +1223,7 @@
       <w:r>
         <w:t xml:space="preserve"> </w:t>
       </w:r>
-      <w:hyperlink r:id="rId13">
+      <w:hyperlink r:id="rId14">
         <w:r>
           <w:rPr>
             <w:rStyle w:val="Hyperlink"/>
@@ -1451,8 +1689,8 @@
         <w:t xml:space="preserve">both-host evidence, VERSION bump (1.0.17/18), gh+glab release.</w:t>
       </w:r>
     </w:p>
-    <w:bookmarkEnd w:id="14"/>
-    <w:bookmarkStart w:id="15" w:name="X4bf7be095085477ec4195c5ea33259b03408111"/>
+    <w:bookmarkEnd w:id="15"/>
+    <w:bookmarkStart w:id="16" w:name="X4bf7be095085477ec4195c5ea33259b03408111"/>
     <w:p>
       <w:pPr>
         <w:pStyle w:val="Heading3"/>
@@ -1767,8 +2005,8 @@
         <w:t xml:space="preserve">to carry every numbered anchor + canonical-authority cross-references</w:t>
       </w:r>
     </w:p>
-    <w:bookmarkEnd w:id="15"/>
-    <w:bookmarkStart w:id="16" w:name="X9597a4ec2f18a9b28ff1f606dbcb4fc46cb4e4b"/>
+    <w:bookmarkEnd w:id="16"/>
+    <w:bookmarkStart w:id="17" w:name="X9597a4ec2f18a9b28ff1f606dbcb4fc46cb4e4b"/>
     <w:p>
       <w:pPr>
         <w:pStyle w:val="Heading3"/>
@@ -2131,8 +2369,8 @@
         <w:t xml:space="preserve">3 concurrent scopes, all registered + active simultaneously ✓</w:t>
       </w:r>
     </w:p>
-    <w:bookmarkEnd w:id="16"/>
-    <w:bookmarkStart w:id="17" w:name="X06cb01c5625e5cfa81a37477bd54d4d45671fdf"/>
+    <w:bookmarkEnd w:id="17"/>
+    <w:bookmarkStart w:id="18" w:name="X06cb01c5625e5cfa81a37477bd54d4d45671fdf"/>
     <w:p>
       <w:pPr>
         <w:pStyle w:val="Heading3"/>
@@ -2313,8 +2551,8 @@
         <w:t xml:space="preserve">— Issues.md D1 (formal topology dispatch matrix)</w:t>
       </w:r>
     </w:p>
-    <w:bookmarkEnd w:id="17"/>
-    <w:bookmarkStart w:id="18" w:name="X6dbba4eb95812a90f20c800e44eb5a6a7358d51"/>
+    <w:bookmarkEnd w:id="18"/>
+    <w:bookmarkStart w:id="19" w:name="X6dbba4eb95812a90f20c800e44eb5a6a7358d51"/>
     <w:p>
       <w:pPr>
         <w:pStyle w:val="Heading3"/>
@@ -2662,8 +2900,8 @@
         <w:t xml:space="preserve">B2.</w:t>
       </w:r>
     </w:p>
-    <w:bookmarkEnd w:id="18"/>
-    <w:bookmarkStart w:id="19" w:name="Xb35b1f3f7dabbb428c448451ce7167cbe2cd4e6"/>
+    <w:bookmarkEnd w:id="19"/>
+    <w:bookmarkStart w:id="20" w:name="Xb35b1f3f7dabbb428c448451ce7167cbe2cd4e6"/>
     <w:p>
       <w:pPr>
         <w:pStyle w:val="Heading3"/>
@@ -2993,8 +3231,8 @@
         <w:t xml:space="preserve">— bump test count from 9 to 11.</w:t>
       </w:r>
     </w:p>
-    <w:bookmarkEnd w:id="19"/>
-    <w:bookmarkStart w:id="20" w:name="X2dea41730e11114ce2f1f24a9ac20830f0c6d8c"/>
+    <w:bookmarkEnd w:id="20"/>
+    <w:bookmarkStart w:id="21" w:name="X2dea41730e11114ce2f1f24a9ac20830f0c6d8c"/>
     <w:p>
       <w:pPr>
         <w:pStyle w:val="Heading3"/>
@@ -3320,8 +3558,8 @@
         <w:t xml:space="preserve">: B1 (CHAL-COVER-001), C1 (TMX-T5), C2 (TMX-T7), C3 (TMX-T8), D1 (TOPO-DISPATCH-001) moved to Fixed.md.</w:t>
       </w:r>
     </w:p>
-    <w:bookmarkEnd w:id="20"/>
-    <w:bookmarkStart w:id="22" w:name="Xa47a1f2e6aab857c5ebcc9727ef871a96653e0e"/>
+    <w:bookmarkEnd w:id="21"/>
+    <w:bookmarkStart w:id="23" w:name="Xa47a1f2e6aab857c5ebcc9727ef871a96653e0e"/>
     <w:p>
       <w:pPr>
         <w:pStyle w:val="Heading3"/>
@@ -4281,7 +4519,7 @@
       <w:r>
         <w:t xml:space="preserve"> </w:t>
       </w:r>
-      <w:hyperlink r:id="rId21">
+      <w:hyperlink r:id="rId22">
         <w:r>
           <w:rPr>
             <w:rStyle w:val="VerbatimChar"/>
@@ -6797,8 +7035,8 @@
         <w:t xml:space="preserve">itself is a §12.10 / §11.4.6 violation — opaque commit message, silent submodule mutation, no CONTINUATION update. Cannot rewrite history per §9 data safety; documenting here is the audit trail.</w:t>
       </w:r>
     </w:p>
-    <w:bookmarkEnd w:id="22"/>
-    <w:bookmarkStart w:id="23" w:name="X39a6c66e0be7f50e7d32ecd13d50cf753d128a7"/>
+    <w:bookmarkEnd w:id="23"/>
+    <w:bookmarkStart w:id="24" w:name="X39a6c66e0be7f50e7d32ecd13d50cf753d128a7"/>
     <w:p>
       <w:pPr>
         <w:pStyle w:val="Heading3"/>
@@ -7132,8 +7370,8 @@
         <w:t xml:space="preserve">§3.6: removed stale "remaining open" note.</w:t>
       </w:r>
     </w:p>
-    <w:bookmarkEnd w:id="23"/>
-    <w:bookmarkStart w:id="24" w:name="X2726eb1fde9d0d5c4232a8af5bb29bc2efcb6ea"/>
+    <w:bookmarkEnd w:id="24"/>
+    <w:bookmarkStart w:id="25" w:name="X2726eb1fde9d0d5c4232a8af5bb29bc2efcb6ea"/>
     <w:p>
       <w:pPr>
         <w:pStyle w:val="Heading3"/>
@@ -8108,8 +8346,8 @@
         <w:t xml:space="preserve">all work").</w:t>
       </w:r>
     </w:p>
-    <w:bookmarkEnd w:id="24"/>
-    <w:bookmarkStart w:id="25" w:name="X50530f0d3163508b53d4e1446abd0230469972a"/>
+    <w:bookmarkEnd w:id="25"/>
+    <w:bookmarkStart w:id="26" w:name="X50530f0d3163508b53d4e1446abd0230469972a"/>
     <w:p>
       <w:pPr>
         <w:pStyle w:val="Heading3"/>
@@ -8837,8 +9075,8 @@
         <w:t xml:space="preserve">headless).</w:t>
       </w:r>
     </w:p>
-    <w:bookmarkEnd w:id="25"/>
-    <w:bookmarkStart w:id="26" w:name="Xb6dc7ed3ec66a5d998e26a7e8534471ca2cc3e0"/>
+    <w:bookmarkEnd w:id="26"/>
+    <w:bookmarkStart w:id="27" w:name="Xb6dc7ed3ec66a5d998e26a7e8534471ca2cc3e0"/>
     <w:p>
       <w:pPr>
         <w:pStyle w:val="Heading3"/>
@@ -9278,8 +9516,8 @@
         <w:t xml:space="preserve">"Make sure we setup the new version once all done." directive.</w:t>
       </w:r>
     </w:p>
-    <w:bookmarkEnd w:id="26"/>
-    <w:bookmarkStart w:id="27" w:name="Xd3af410912ca3cafb170fb407cc411bb8aa2631"/>
+    <w:bookmarkEnd w:id="27"/>
+    <w:bookmarkStart w:id="28" w:name="Xd3af410912ca3cafb170fb407cc411bb8aa2631"/>
     <w:p>
       <w:pPr>
         <w:pStyle w:val="Heading3"/>
@@ -9702,8 +9940,8 @@
         <w:t xml:space="preserve">as deferred post-release smoke.</w:t>
       </w:r>
     </w:p>
-    <w:bookmarkEnd w:id="27"/>
-    <w:bookmarkStart w:id="28" w:name="Xd334663f66da9fbc338b039ddad8ed42ad07243"/>
+    <w:bookmarkEnd w:id="28"/>
+    <w:bookmarkStart w:id="29" w:name="Xd334663f66da9fbc338b039ddad8ed42ad07243"/>
     <w:p>
       <w:pPr>
         <w:pStyle w:val="Heading3"/>
@@ -10180,8 +10418,8 @@
         <w:t xml:space="preserve">preceded the tag; no spot-check shortcut).</w:t>
       </w:r>
     </w:p>
-    <w:bookmarkEnd w:id="28"/>
-    <w:bookmarkStart w:id="29" w:name="Xd55c57cd252c85ec7bdcd4b23e73cec6cfc2cd4"/>
+    <w:bookmarkEnd w:id="29"/>
+    <w:bookmarkStart w:id="30" w:name="Xd55c57cd252c85ec7bdcd4b23e73cec6cfc2cd4"/>
     <w:p>
       <w:pPr>
         <w:pStyle w:val="Heading3"/>
@@ -11252,8 +11490,8 @@
         <w:t xml:space="preserve">tests 09/13/14 alongside the Darwin branches running today.</w:t>
       </w:r>
     </w:p>
-    <w:bookmarkEnd w:id="29"/>
-    <w:bookmarkStart w:id="30" w:name="X572a5be484f72dd1209250eb21ec3b6cad7931d"/>
+    <w:bookmarkEnd w:id="30"/>
+    <w:bookmarkStart w:id="31" w:name="X572a5be484f72dd1209250eb21ec3b6cad7931d"/>
     <w:p>
       <w:pPr>
         <w:pStyle w:val="Heading3"/>
@@ -12201,8 +12439,8 @@
         <w:t xml:space="preserve">topology-correct), e2e 9/0/0.</w:t>
       </w:r>
     </w:p>
-    <w:bookmarkEnd w:id="30"/>
-    <w:bookmarkStart w:id="31" w:name="Xdc1f843cc4a7cc6c48cb008be32d2d72d9f426c"/>
+    <w:bookmarkEnd w:id="31"/>
+    <w:bookmarkStart w:id="32" w:name="Xdc1f843cc4a7cc6c48cb008be32d2d72d9f426c"/>
     <w:p>
       <w:pPr>
         <w:pStyle w:val="Heading3"/>
@@ -12811,9 +13049,9 @@
         <w:t xml:space="preserve">GREEN, suite PASS=13/0/SKIP=5, meta-test 18/0/6, e2e 9/0/0.</w:t>
       </w:r>
     </w:p>
-    <w:bookmarkEnd w:id="31"/>
     <w:bookmarkEnd w:id="32"/>
-    <w:bookmarkStart w:id="33" w:name="Xf9daad60751079e769ca58715403a214307050f"/>
+    <w:bookmarkEnd w:id="33"/>
+    <w:bookmarkStart w:id="34" w:name="Xf9daad60751079e769ca58715403a214307050f"/>
     <w:p>
       <w:pPr>
         <w:pStyle w:val="Heading2"/>
@@ -13455,8 +13693,8 @@
         <w:t xml:space="preserve">(2026-05-07) — Initial vasic-digital/tmux: migrated from ATMOSphere project + per-session containerization plan + 8-test verification gate.</w:t>
       </w:r>
     </w:p>
-    <w:bookmarkEnd w:id="33"/>
-    <w:bookmarkStart w:id="34" w:name="X6eb44e94951e80621b9fe10f2f53b34d95aee13"/>
+    <w:bookmarkEnd w:id="34"/>
+    <w:bookmarkStart w:id="35" w:name="X6eb44e94951e80621b9fe10f2f53b34d95aee13"/>
     <w:p>
       <w:pPr>
         <w:pStyle w:val="Heading2"/>
@@ -13585,8 +13823,8 @@
         <w:t xml:space="preserve">Update this document in the SAME commit as the work itself (§12.10 invariant)</w:t>
       </w:r>
     </w:p>
-    <w:bookmarkEnd w:id="34"/>
     <w:bookmarkEnd w:id="35"/>
+    <w:bookmarkEnd w:id="36"/>
     <w:sectPr>
       <w:footnotePr>
         <w:numRestart w:val="eachSect"/>

</xml_diff>

<commit_message>
v1.0.18 post-release CONTINUATION sync — §3.18 DONE/RELEASED (GitHub + GitLab live). Plain mouse-drag select+copy in Claude Code proven on Linux + macOS with a real mouse. Note: test 16 nezha full-suite flake (passes standalone + retry GREEN), tracked.
Signed-off-by: Milos Vasic <i@mvasic.ru>
</commit_message>
<xml_diff>
--- a/CONTINUATION.docx
+++ b/CONTINUATION.docx
@@ -10,7 +10,7 @@
         <w:t xml:space="preserve">CONTINUATION</w:t>
       </w:r>
     </w:p>
-    <w:bookmarkStart w:id="36" w:name="continuationmd--vasic-digital-tmux"/>
+    <w:bookmarkStart w:id="38" w:name="continuationmd--vasic-digital-tmux"/>
     <w:p>
       <w:pPr>
         <w:pStyle w:val="Heading1"/>
@@ -34,7 +34,7 @@
         <w:t xml:space="preserve"> </w:t>
       </w:r>
       <w:r>
-        <w:t xml:space="preserve">2026-05-29T12:30Z</w:t>
+        <w:t xml:space="preserve">2026-05-29T12:45Z</w:t>
       </w:r>
     </w:p>
     <w:bookmarkStart w:id="9" w:name="X46e2b1e0ed863e0637bb3aab0aa22fad9aaafec"/>
@@ -930,7 +930,7 @@
       </w:r>
     </w:p>
     <w:bookmarkEnd w:id="11"/>
-    <w:bookmarkStart w:id="33" w:name="X9bbd2c3048cfbd7ee7622f0d2295634d9b66aad"/>
+    <w:bookmarkStart w:id="35" w:name="X9bbd2c3048cfbd7ee7622f0d2295634d9b66aad"/>
     <w:p>
       <w:pPr>
         <w:pStyle w:val="Heading2"/>
@@ -939,7 +939,7 @@
         <w:t xml:space="preserve">§3 — Active work</w:t>
       </w:r>
     </w:p>
-    <w:bookmarkStart w:id="12" w:name="X355fc9a1cf777007644228a932aa130e2c8e704"/>
+    <w:bookmarkStart w:id="14" w:name="X355fc9a1cf777007644228a932aa130e2c8e704"/>
     <w:p>
       <w:pPr>
         <w:pStyle w:val="Heading3"/>
@@ -963,7 +963,38 @@
         <w:t xml:space="preserve"> </w:t>
       </w:r>
       <w:r>
-        <w:t xml:space="preserve">IN PROGRESS (fix + Mistborn proof done; dual-host setup + release pending).</w:t>
+        <w:t xml:space="preserve">DONE — RELEASED v1.0.18 (2026-05-29). GitHub:</w:t>
+      </w:r>
+      <w:r>
+        <w:t xml:space="preserve"> </w:t>
+      </w:r>
+      <w:hyperlink r:id="rId12">
+        <w:r>
+          <w:rPr>
+            <w:rStyle w:val="Hyperlink"/>
+          </w:rPr>
+          <w:t xml:space="preserve">https://github.com/vasic-digital/tmux/releases/tag/v1.0.18</w:t>
+        </w:r>
+      </w:hyperlink>
+      <w:r>
+        <w:t xml:space="preserve"> </w:t>
+      </w:r>
+      <w:r>
+        <w:t xml:space="preserve">· GitLab:</w:t>
+      </w:r>
+      <w:r>
+        <w:t xml:space="preserve"> </w:t>
+      </w:r>
+      <w:hyperlink r:id="rId13">
+        <w:r>
+          <w:rPr>
+            <w:rStyle w:val="Hyperlink"/>
+          </w:rPr>
+          <w:t xml:space="preserve">https://gitlab.com/vasic-digital/tmux/-/releases/v1.0.18</w:t>
+        </w:r>
+      </w:hyperlink>
+      <w:r>
+        <w:t xml:space="preserve">. Real-mouse PROVEN on BOTH platforms: Mistborn (suite 51/0/4 + meta 48/0 + real cliclick cursor drag over iTerm2 → pbpaste) AND nezha Linux (verify 43/0/12 GREEN + headless SGR real-mouse-drag → @clip sink, after the TERM=xterm-256color test-harness fix). Commits 5c667cc → 06e43d0 → 69d1418. NOTE: test 16 (window-name) flaked once under full-suite load on nezha (passes 3/3 standalone + GREEN on retry) — pre-existing §11.4.50 reliability issue, unrelated to the mouse fix; tracked for a future poll-with-budget fix.</w:t>
       </w:r>
     </w:p>
     <w:p>
@@ -1176,8 +1207,8 @@
         <w:t xml:space="preserve">(refresh ~/.tmux.conf), nezha headless test-56 proof, v1.0.18 release.</w:t>
       </w:r>
     </w:p>
-    <w:bookmarkEnd w:id="12"/>
-    <w:bookmarkStart w:id="15" w:name="Xebab2c91518890b5812c0749bb46435dd248681"/>
+    <w:bookmarkEnd w:id="14"/>
+    <w:bookmarkStart w:id="17" w:name="Xebab2c91518890b5812c0749bb46435dd248681"/>
     <w:p>
       <w:pPr>
         <w:pStyle w:val="Heading3"/>
@@ -1206,7 +1237,7 @@
       <w:r>
         <w:t xml:space="preserve"> </w:t>
       </w:r>
-      <w:hyperlink r:id="rId13">
+      <w:hyperlink r:id="rId15">
         <w:r>
           <w:rPr>
             <w:rStyle w:val="Hyperlink"/>
@@ -1223,7 +1254,7 @@
       <w:r>
         <w:t xml:space="preserve"> </w:t>
       </w:r>
-      <w:hyperlink r:id="rId14">
+      <w:hyperlink r:id="rId16">
         <w:r>
           <w:rPr>
             <w:rStyle w:val="Hyperlink"/>
@@ -1689,8 +1720,8 @@
         <w:t xml:space="preserve">both-host evidence, VERSION bump (1.0.17/18), gh+glab release.</w:t>
       </w:r>
     </w:p>
-    <w:bookmarkEnd w:id="15"/>
-    <w:bookmarkStart w:id="16" w:name="X4bf7be095085477ec4195c5ea33259b03408111"/>
+    <w:bookmarkEnd w:id="17"/>
+    <w:bookmarkStart w:id="18" w:name="X4bf7be095085477ec4195c5ea33259b03408111"/>
     <w:p>
       <w:pPr>
         <w:pStyle w:val="Heading3"/>
@@ -2005,8 +2036,8 @@
         <w:t xml:space="preserve">to carry every numbered anchor + canonical-authority cross-references</w:t>
       </w:r>
     </w:p>
-    <w:bookmarkEnd w:id="16"/>
-    <w:bookmarkStart w:id="17" w:name="X9597a4ec2f18a9b28ff1f606dbcb4fc46cb4e4b"/>
+    <w:bookmarkEnd w:id="18"/>
+    <w:bookmarkStart w:id="19" w:name="X9597a4ec2f18a9b28ff1f606dbcb4fc46cb4e4b"/>
     <w:p>
       <w:pPr>
         <w:pStyle w:val="Heading3"/>
@@ -2369,8 +2400,8 @@
         <w:t xml:space="preserve">3 concurrent scopes, all registered + active simultaneously ✓</w:t>
       </w:r>
     </w:p>
-    <w:bookmarkEnd w:id="17"/>
-    <w:bookmarkStart w:id="18" w:name="X06cb01c5625e5cfa81a37477bd54d4d45671fdf"/>
+    <w:bookmarkEnd w:id="19"/>
+    <w:bookmarkStart w:id="20" w:name="X06cb01c5625e5cfa81a37477bd54d4d45671fdf"/>
     <w:p>
       <w:pPr>
         <w:pStyle w:val="Heading3"/>
@@ -2551,8 +2582,8 @@
         <w:t xml:space="preserve">— Issues.md D1 (formal topology dispatch matrix)</w:t>
       </w:r>
     </w:p>
-    <w:bookmarkEnd w:id="18"/>
-    <w:bookmarkStart w:id="19" w:name="X6dbba4eb95812a90f20c800e44eb5a6a7358d51"/>
+    <w:bookmarkEnd w:id="20"/>
+    <w:bookmarkStart w:id="21" w:name="X6dbba4eb95812a90f20c800e44eb5a6a7358d51"/>
     <w:p>
       <w:pPr>
         <w:pStyle w:val="Heading3"/>
@@ -2900,8 +2931,8 @@
         <w:t xml:space="preserve">B2.</w:t>
       </w:r>
     </w:p>
-    <w:bookmarkEnd w:id="19"/>
-    <w:bookmarkStart w:id="20" w:name="Xb35b1f3f7dabbb428c448451ce7167cbe2cd4e6"/>
+    <w:bookmarkEnd w:id="21"/>
+    <w:bookmarkStart w:id="22" w:name="Xb35b1f3f7dabbb428c448451ce7167cbe2cd4e6"/>
     <w:p>
       <w:pPr>
         <w:pStyle w:val="Heading3"/>
@@ -3231,8 +3262,8 @@
         <w:t xml:space="preserve">— bump test count from 9 to 11.</w:t>
       </w:r>
     </w:p>
-    <w:bookmarkEnd w:id="20"/>
-    <w:bookmarkStart w:id="21" w:name="X2dea41730e11114ce2f1f24a9ac20830f0c6d8c"/>
+    <w:bookmarkEnd w:id="22"/>
+    <w:bookmarkStart w:id="23" w:name="X2dea41730e11114ce2f1f24a9ac20830f0c6d8c"/>
     <w:p>
       <w:pPr>
         <w:pStyle w:val="Heading3"/>
@@ -3558,8 +3589,8 @@
         <w:t xml:space="preserve">: B1 (CHAL-COVER-001), C1 (TMX-T5), C2 (TMX-T7), C3 (TMX-T8), D1 (TOPO-DISPATCH-001) moved to Fixed.md.</w:t>
       </w:r>
     </w:p>
-    <w:bookmarkEnd w:id="21"/>
-    <w:bookmarkStart w:id="23" w:name="Xa47a1f2e6aab857c5ebcc9727ef871a96653e0e"/>
+    <w:bookmarkEnd w:id="23"/>
+    <w:bookmarkStart w:id="25" w:name="Xa47a1f2e6aab857c5ebcc9727ef871a96653e0e"/>
     <w:p>
       <w:pPr>
         <w:pStyle w:val="Heading3"/>
@@ -4519,7 +4550,7 @@
       <w:r>
         <w:t xml:space="preserve"> </w:t>
       </w:r>
-      <w:hyperlink r:id="rId22">
+      <w:hyperlink r:id="rId24">
         <w:r>
           <w:rPr>
             <w:rStyle w:val="VerbatimChar"/>
@@ -7035,8 +7066,8 @@
         <w:t xml:space="preserve">itself is a §12.10 / §11.4.6 violation — opaque commit message, silent submodule mutation, no CONTINUATION update. Cannot rewrite history per §9 data safety; documenting here is the audit trail.</w:t>
       </w:r>
     </w:p>
-    <w:bookmarkEnd w:id="23"/>
-    <w:bookmarkStart w:id="24" w:name="X39a6c66e0be7f50e7d32ecd13d50cf753d128a7"/>
+    <w:bookmarkEnd w:id="25"/>
+    <w:bookmarkStart w:id="26" w:name="X39a6c66e0be7f50e7d32ecd13d50cf753d128a7"/>
     <w:p>
       <w:pPr>
         <w:pStyle w:val="Heading3"/>
@@ -7370,8 +7401,8 @@
         <w:t xml:space="preserve">§3.6: removed stale "remaining open" note.</w:t>
       </w:r>
     </w:p>
-    <w:bookmarkEnd w:id="24"/>
-    <w:bookmarkStart w:id="25" w:name="X2726eb1fde9d0d5c4232a8af5bb29bc2efcb6ea"/>
+    <w:bookmarkEnd w:id="26"/>
+    <w:bookmarkStart w:id="27" w:name="X2726eb1fde9d0d5c4232a8af5bb29bc2efcb6ea"/>
     <w:p>
       <w:pPr>
         <w:pStyle w:val="Heading3"/>
@@ -8346,8 +8377,8 @@
         <w:t xml:space="preserve">all work").</w:t>
       </w:r>
     </w:p>
-    <w:bookmarkEnd w:id="25"/>
-    <w:bookmarkStart w:id="26" w:name="X50530f0d3163508b53d4e1446abd0230469972a"/>
+    <w:bookmarkEnd w:id="27"/>
+    <w:bookmarkStart w:id="28" w:name="X50530f0d3163508b53d4e1446abd0230469972a"/>
     <w:p>
       <w:pPr>
         <w:pStyle w:val="Heading3"/>
@@ -9075,8 +9106,8 @@
         <w:t xml:space="preserve">headless).</w:t>
       </w:r>
     </w:p>
-    <w:bookmarkEnd w:id="26"/>
-    <w:bookmarkStart w:id="27" w:name="Xb6dc7ed3ec66a5d998e26a7e8534471ca2cc3e0"/>
+    <w:bookmarkEnd w:id="28"/>
+    <w:bookmarkStart w:id="29" w:name="Xb6dc7ed3ec66a5d998e26a7e8534471ca2cc3e0"/>
     <w:p>
       <w:pPr>
         <w:pStyle w:val="Heading3"/>
@@ -9516,8 +9547,8 @@
         <w:t xml:space="preserve">"Make sure we setup the new version once all done." directive.</w:t>
       </w:r>
     </w:p>
-    <w:bookmarkEnd w:id="27"/>
-    <w:bookmarkStart w:id="28" w:name="Xd3af410912ca3cafb170fb407cc411bb8aa2631"/>
+    <w:bookmarkEnd w:id="29"/>
+    <w:bookmarkStart w:id="30" w:name="Xd3af410912ca3cafb170fb407cc411bb8aa2631"/>
     <w:p>
       <w:pPr>
         <w:pStyle w:val="Heading3"/>
@@ -9940,8 +9971,8 @@
         <w:t xml:space="preserve">as deferred post-release smoke.</w:t>
       </w:r>
     </w:p>
-    <w:bookmarkEnd w:id="28"/>
-    <w:bookmarkStart w:id="29" w:name="Xd334663f66da9fbc338b039ddad8ed42ad07243"/>
+    <w:bookmarkEnd w:id="30"/>
+    <w:bookmarkStart w:id="31" w:name="Xd334663f66da9fbc338b039ddad8ed42ad07243"/>
     <w:p>
       <w:pPr>
         <w:pStyle w:val="Heading3"/>
@@ -10418,8 +10449,8 @@
         <w:t xml:space="preserve">preceded the tag; no spot-check shortcut).</w:t>
       </w:r>
     </w:p>
-    <w:bookmarkEnd w:id="29"/>
-    <w:bookmarkStart w:id="30" w:name="Xd55c57cd252c85ec7bdcd4b23e73cec6cfc2cd4"/>
+    <w:bookmarkEnd w:id="31"/>
+    <w:bookmarkStart w:id="32" w:name="Xd55c57cd252c85ec7bdcd4b23e73cec6cfc2cd4"/>
     <w:p>
       <w:pPr>
         <w:pStyle w:val="Heading3"/>
@@ -11490,8 +11521,8 @@
         <w:t xml:space="preserve">tests 09/13/14 alongside the Darwin branches running today.</w:t>
       </w:r>
     </w:p>
-    <w:bookmarkEnd w:id="30"/>
-    <w:bookmarkStart w:id="31" w:name="X572a5be484f72dd1209250eb21ec3b6cad7931d"/>
+    <w:bookmarkEnd w:id="32"/>
+    <w:bookmarkStart w:id="33" w:name="X572a5be484f72dd1209250eb21ec3b6cad7931d"/>
     <w:p>
       <w:pPr>
         <w:pStyle w:val="Heading3"/>
@@ -12439,8 +12470,8 @@
         <w:t xml:space="preserve">topology-correct), e2e 9/0/0.</w:t>
       </w:r>
     </w:p>
-    <w:bookmarkEnd w:id="31"/>
-    <w:bookmarkStart w:id="32" w:name="Xdc1f843cc4a7cc6c48cb008be32d2d72d9f426c"/>
+    <w:bookmarkEnd w:id="33"/>
+    <w:bookmarkStart w:id="34" w:name="Xdc1f843cc4a7cc6c48cb008be32d2d72d9f426c"/>
     <w:p>
       <w:pPr>
         <w:pStyle w:val="Heading3"/>
@@ -13049,9 +13080,9 @@
         <w:t xml:space="preserve">GREEN, suite PASS=13/0/SKIP=5, meta-test 18/0/6, e2e 9/0/0.</w:t>
       </w:r>
     </w:p>
-    <w:bookmarkEnd w:id="32"/>
-    <w:bookmarkEnd w:id="33"/>
-    <w:bookmarkStart w:id="34" w:name="Xf9daad60751079e769ca58715403a214307050f"/>
+    <w:bookmarkEnd w:id="34"/>
+    <w:bookmarkEnd w:id="35"/>
+    <w:bookmarkStart w:id="36" w:name="Xf9daad60751079e769ca58715403a214307050f"/>
     <w:p>
       <w:pPr>
         <w:pStyle w:val="Heading2"/>
@@ -13693,8 +13724,8 @@
         <w:t xml:space="preserve">(2026-05-07) — Initial vasic-digital/tmux: migrated from ATMOSphere project + per-session containerization plan + 8-test verification gate.</w:t>
       </w:r>
     </w:p>
-    <w:bookmarkEnd w:id="34"/>
-    <w:bookmarkStart w:id="35" w:name="X6eb44e94951e80621b9fe10f2f53b34d95aee13"/>
+    <w:bookmarkEnd w:id="36"/>
+    <w:bookmarkStart w:id="37" w:name="X6eb44e94951e80621b9fe10f2f53b34d95aee13"/>
     <w:p>
       <w:pPr>
         <w:pStyle w:val="Heading2"/>
@@ -13823,8 +13854,8 @@
         <w:t xml:space="preserve">Update this document in the SAME commit as the work itself (§12.10 invariant)</w:t>
       </w:r>
     </w:p>
-    <w:bookmarkEnd w:id="35"/>
-    <w:bookmarkEnd w:id="36"/>
+    <w:bookmarkEnd w:id="37"/>
+    <w:bookmarkEnd w:id="38"/>
     <w:sectPr>
       <w:footnotePr>
         <w:numRestart w:val="eachSect"/>

</xml_diff>

<commit_message>
CONTINUATION §3.19 — both hosts updated to HEAD a0a3f85 + fully verified GREEN (Mistborn run_all 51/0/4 + meta 48/0; nezha run_all 43/0/12 + meta 48/0; M22 CAUGHT both). codegraph non-interactive PATH probe added to run_all + meta-test.
Signed-off-by: Milos Vasic <i@mvasic.ru>
</commit_message>
<xml_diff>
--- a/CONTINUATION.docx
+++ b/CONTINUATION.docx
@@ -10,7 +10,7 @@
         <w:t xml:space="preserve">CONTINUATION</w:t>
       </w:r>
     </w:p>
-    <w:bookmarkStart w:id="38" w:name="continuationmd--vasic-digital-tmux"/>
+    <w:bookmarkStart w:id="39" w:name="continuationmd--vasic-digital-tmux"/>
     <w:p>
       <w:pPr>
         <w:pStyle w:val="Heading1"/>
@@ -34,7 +34,7 @@
         <w:t xml:space="preserve"> </w:t>
       </w:r>
       <w:r>
-        <w:t xml:space="preserve">2026-05-29T12:45Z</w:t>
+        <w:t xml:space="preserve">2026-05-29T13:30Z</w:t>
       </w:r>
     </w:p>
     <w:bookmarkStart w:id="9" w:name="X46e2b1e0ed863e0637bb3aab0aa22fad9aaafec"/>
@@ -930,7 +930,7 @@
       </w:r>
     </w:p>
     <w:bookmarkEnd w:id="11"/>
-    <w:bookmarkStart w:id="35" w:name="X9bbd2c3048cfbd7ee7622f0d2295634d9b66aad"/>
+    <w:bookmarkStart w:id="36" w:name="X9bbd2c3048cfbd7ee7622f0d2295634d9b66aad"/>
     <w:p>
       <w:pPr>
         <w:pStyle w:val="Heading2"/>
@@ -939,12 +939,205 @@
         <w:t xml:space="preserve">§3 — Active work</w:t>
       </w:r>
     </w:p>
-    <w:bookmarkStart w:id="14" w:name="X355fc9a1cf777007644228a932aa130e2c8e704"/>
+    <w:bookmarkStart w:id="12" w:name="Xffeb255c07f7fe8250572ddb15b59dcaf62972a"/>
     <w:p>
       <w:pPr>
         <w:pStyle w:val="Heading3"/>
       </w:pPr>
       <w:r>
+        <w:t xml:space="preserve">§3.19 — Dual-host update to latest HEAD + full test/verify (2026-05-29)</w:t>
+      </w:r>
+    </w:p>
+    <w:p>
+      <w:pPr>
+        <w:pStyle w:val="FirstParagraph"/>
+      </w:pPr>
+      <w:r>
+        <w:rPr>
+          <w:b/>
+          <w:bCs/>
+        </w:rPr>
+        <w:t xml:space="preserve">Status:</w:t>
+      </w:r>
+      <w:r>
+        <w:t xml:space="preserve"> </w:t>
+      </w:r>
+      <w:r>
+        <w:t xml:space="preserve">DONE. Both hosts pulled to HEAD</w:t>
+      </w:r>
+      <w:r>
+        <w:t xml:space="preserve"> </w:t>
+      </w:r>
+      <w:r>
+        <w:rPr>
+          <w:rStyle w:val="VerbatimChar"/>
+        </w:rPr>
+        <w:t xml:space="preserve">a0a3f85</w:t>
+      </w:r>
+      <w:r>
+        <w:t xml:space="preserve"> </w:t>
+      </w:r>
+      <w:r>
+        <w:t xml:space="preserve">and fully verified.</w:t>
+      </w:r>
+      <w:r>
+        <w:t xml:space="preserve"> </w:t>
+      </w:r>
+      <w:r>
+        <w:t xml:space="preserve">Mistborn (Darwin): run_all</w:t>
+      </w:r>
+      <w:r>
+        <w:t xml:space="preserve"> </w:t>
+      </w:r>
+      <w:r>
+        <w:rPr>
+          <w:rStyle w:val="VerbatimChar"/>
+        </w:rPr>
+        <w:t xml:space="preserve">PASS=51 FAIL=0 SKIP=4</w:t>
+      </w:r>
+      <w:r>
+        <w:t xml:space="preserve">, meta</w:t>
+      </w:r>
+      <w:r>
+        <w:t xml:space="preserve"> </w:t>
+      </w:r>
+      <w:r>
+        <w:rPr>
+          <w:rStyle w:val="VerbatimChar"/>
+        </w:rPr>
+        <w:t xml:space="preserve">48 CAUGHT / 0 ESCAPED</w:t>
+      </w:r>
+      <w:r>
+        <w:t xml:space="preserve"> </w:t>
+      </w:r>
+      <w:r>
+        <w:t xml:space="preserve">(M22 CAUGHT). nezha (Linux): run_all</w:t>
+      </w:r>
+      <w:r>
+        <w:t xml:space="preserve"> </w:t>
+      </w:r>
+      <w:r>
+        <w:rPr>
+          <w:rStyle w:val="VerbatimChar"/>
+        </w:rPr>
+        <w:t xml:space="preserve">PASS=43 FAIL=0 SKIP=12</w:t>
+      </w:r>
+      <w:r>
+        <w:t xml:space="preserve">, meta</w:t>
+      </w:r>
+      <w:r>
+        <w:t xml:space="preserve"> </w:t>
+      </w:r>
+      <w:r>
+        <w:rPr>
+          <w:rStyle w:val="VerbatimChar"/>
+        </w:rPr>
+        <w:t xml:space="preserve">48 CAUGHT / 0 ESCAPED</w:t>
+      </w:r>
+      <w:r>
+        <w:t xml:space="preserve"> </w:t>
+      </w:r>
+      <w:r>
+        <w:t xml:space="preserve">(M22 CAUGHT). Fix landed this round: added the A31</w:t>
+      </w:r>
+      <w:r>
+        <w:t xml:space="preserve"> </w:t>
+      </w:r>
+      <w:r>
+        <w:t xml:space="preserve">npm-prefix PATH probe to</w:t>
+      </w:r>
+      <w:r>
+        <w:t xml:space="preserve"> </w:t>
+      </w:r>
+      <w:r>
+        <w:rPr>
+          <w:rStyle w:val="VerbatimChar"/>
+        </w:rPr>
+        <w:t xml:space="preserve">scripts/tests/run_all.sh</w:t>
+      </w:r>
+      <w:r>
+        <w:t xml:space="preserve"> </w:t>
+      </w:r>
+      <w:r>
+        <w:t xml:space="preserve">+</w:t>
+      </w:r>
+      <w:r>
+        <w:t xml:space="preserve"> </w:t>
+      </w:r>
+      <w:r>
+        <w:rPr>
+          <w:rStyle w:val="VerbatimChar"/>
+        </w:rPr>
+        <w:t xml:space="preserve">meta_test_false_positive_proof.sh</w:t>
+      </w:r>
+      <w:r>
+        <w:t xml:space="preserve"> </w:t>
+      </w:r>
+      <w:r>
+        <w:t xml:space="preserve">(commits 5d6196c, a0a3f85) so the codegraph tests (20/22) + M22 mutation</w:t>
+      </w:r>
+      <w:r>
+        <w:t xml:space="preserve"> </w:t>
+      </w:r>
+      <w:r>
+        <w:t xml:space="preserve">resolve the CLI in NON-INTERACTIVE shells too — nezha's</w:t>
+      </w:r>
+      <w:r>
+        <w:t xml:space="preserve"> </w:t>
+      </w:r>
+      <w:r>
+        <w:rPr>
+          <w:rStyle w:val="VerbatimChar"/>
+        </w:rPr>
+        <w:t xml:space="preserve">.bashrc</w:t>
+      </w:r>
+      <w:r>
+        <w:t xml:space="preserve"> </w:t>
+      </w:r>
+      <w:r>
+        <w:t xml:space="preserve">adds</w:t>
+      </w:r>
+      <w:r>
+        <w:t xml:space="preserve"> </w:t>
+      </w:r>
+      <w:r>
+        <w:rPr>
+          <w:rStyle w:val="VerbatimChar"/>
+        </w:rPr>
+        <w:t xml:space="preserve">~/.npm-global/bin</w:t>
+      </w:r>
+      <w:r>
+        <w:t xml:space="preserve"> </w:t>
+      </w:r>
+      <w:r>
+        <w:t xml:space="preserve">only behind an interactive-guard, so standalone run_all</w:t>
+      </w:r>
+      <w:r>
+        <w:t xml:space="preserve"> </w:t>
+      </w:r>
+      <w:r>
+        <w:t xml:space="preserve">over ssh-batch previously failed 20/22 spuriously while real interactive agent</w:t>
+      </w:r>
+      <w:r>
+        <w:t xml:space="preserve"> </w:t>
+      </w:r>
+      <w:r>
+        <w:t xml:space="preserve">usage worked. test 16 nezha full-suite flake ((window-name test, passes standalone))</w:t>
+      </w:r>
+      <w:r>
+        <w:t xml:space="preserve"> </w:t>
+      </w:r>
+      <w:r>
+        <w:t xml:space="preserve">did not recur this round.</w:t>
+      </w:r>
+    </w:p>
+    <w:bookmarkEnd w:id="12"/>
+    <w:bookmarkStart w:id="15" w:name="X355fc9a1cf777007644228a932aa130e2c8e704"/>
+    <w:p>
+      <w:pPr>
+        <w:pStyle w:val="Heading3"/>
+      </w:pPr>
+      <w:r>
         <w:t xml:space="preserve">§3.18 — v1.0.18 REAL mouse-copy fix: plain drag selects+copies in Claude Code, proven with a real mouse (2026-05-29)</w:t>
       </w:r>
     </w:p>
@@ -968,7 +1161,7 @@
       <w:r>
         <w:t xml:space="preserve"> </w:t>
       </w:r>
-      <w:hyperlink r:id="rId12">
+      <w:hyperlink r:id="rId13">
         <w:r>
           <w:rPr>
             <w:rStyle w:val="Hyperlink"/>
@@ -985,7 +1178,7 @@
       <w:r>
         <w:t xml:space="preserve"> </w:t>
       </w:r>
-      <w:hyperlink r:id="rId13">
+      <w:hyperlink r:id="rId14">
         <w:r>
           <w:rPr>
             <w:rStyle w:val="Hyperlink"/>
@@ -1207,8 +1400,8 @@
         <w:t xml:space="preserve">(refresh ~/.tmux.conf), nezha headless test-56 proof, v1.0.18 release.</w:t>
       </w:r>
     </w:p>
-    <w:bookmarkEnd w:id="14"/>
-    <w:bookmarkStart w:id="17" w:name="Xebab2c91518890b5812c0749bb46435dd248681"/>
+    <w:bookmarkEnd w:id="15"/>
+    <w:bookmarkStart w:id="18" w:name="Xebab2c91518890b5812c0749bb46435dd248681"/>
     <w:p>
       <w:pPr>
         <w:pStyle w:val="Heading3"/>
@@ -1237,7 +1430,7 @@
       <w:r>
         <w:t xml:space="preserve"> </w:t>
       </w:r>
-      <w:hyperlink r:id="rId15">
+      <w:hyperlink r:id="rId16">
         <w:r>
           <w:rPr>
             <w:rStyle w:val="Hyperlink"/>
@@ -1254,7 +1447,7 @@
       <w:r>
         <w:t xml:space="preserve"> </w:t>
       </w:r>
-      <w:hyperlink r:id="rId16">
+      <w:hyperlink r:id="rId17">
         <w:r>
           <w:rPr>
             <w:rStyle w:val="Hyperlink"/>
@@ -1720,8 +1913,8 @@
         <w:t xml:space="preserve">both-host evidence, VERSION bump (1.0.17/18), gh+glab release.</w:t>
       </w:r>
     </w:p>
-    <w:bookmarkEnd w:id="17"/>
-    <w:bookmarkStart w:id="18" w:name="X4bf7be095085477ec4195c5ea33259b03408111"/>
+    <w:bookmarkEnd w:id="18"/>
+    <w:bookmarkStart w:id="19" w:name="X4bf7be095085477ec4195c5ea33259b03408111"/>
     <w:p>
       <w:pPr>
         <w:pStyle w:val="Heading3"/>
@@ -2036,8 +2229,8 @@
         <w:t xml:space="preserve">to carry every numbered anchor + canonical-authority cross-references</w:t>
       </w:r>
     </w:p>
-    <w:bookmarkEnd w:id="18"/>
-    <w:bookmarkStart w:id="19" w:name="X9597a4ec2f18a9b28ff1f606dbcb4fc46cb4e4b"/>
+    <w:bookmarkEnd w:id="19"/>
+    <w:bookmarkStart w:id="20" w:name="X9597a4ec2f18a9b28ff1f606dbcb4fc46cb4e4b"/>
     <w:p>
       <w:pPr>
         <w:pStyle w:val="Heading3"/>
@@ -2400,8 +2593,8 @@
         <w:t xml:space="preserve">3 concurrent scopes, all registered + active simultaneously ✓</w:t>
       </w:r>
     </w:p>
-    <w:bookmarkEnd w:id="19"/>
-    <w:bookmarkStart w:id="20" w:name="X06cb01c5625e5cfa81a37477bd54d4d45671fdf"/>
+    <w:bookmarkEnd w:id="20"/>
+    <w:bookmarkStart w:id="21" w:name="X06cb01c5625e5cfa81a37477bd54d4d45671fdf"/>
     <w:p>
       <w:pPr>
         <w:pStyle w:val="Heading3"/>
@@ -2582,8 +2775,8 @@
         <w:t xml:space="preserve">— Issues.md D1 (formal topology dispatch matrix)</w:t>
       </w:r>
     </w:p>
-    <w:bookmarkEnd w:id="20"/>
-    <w:bookmarkStart w:id="21" w:name="X6dbba4eb95812a90f20c800e44eb5a6a7358d51"/>
+    <w:bookmarkEnd w:id="21"/>
+    <w:bookmarkStart w:id="22" w:name="X6dbba4eb95812a90f20c800e44eb5a6a7358d51"/>
     <w:p>
       <w:pPr>
         <w:pStyle w:val="Heading3"/>
@@ -2931,8 +3124,8 @@
         <w:t xml:space="preserve">B2.</w:t>
       </w:r>
     </w:p>
-    <w:bookmarkEnd w:id="21"/>
-    <w:bookmarkStart w:id="22" w:name="Xb35b1f3f7dabbb428c448451ce7167cbe2cd4e6"/>
+    <w:bookmarkEnd w:id="22"/>
+    <w:bookmarkStart w:id="23" w:name="Xb35b1f3f7dabbb428c448451ce7167cbe2cd4e6"/>
     <w:p>
       <w:pPr>
         <w:pStyle w:val="Heading3"/>
@@ -3262,8 +3455,8 @@
         <w:t xml:space="preserve">— bump test count from 9 to 11.</w:t>
       </w:r>
     </w:p>
-    <w:bookmarkEnd w:id="22"/>
-    <w:bookmarkStart w:id="23" w:name="X2dea41730e11114ce2f1f24a9ac20830f0c6d8c"/>
+    <w:bookmarkEnd w:id="23"/>
+    <w:bookmarkStart w:id="24" w:name="X2dea41730e11114ce2f1f24a9ac20830f0c6d8c"/>
     <w:p>
       <w:pPr>
         <w:pStyle w:val="Heading3"/>
@@ -3589,8 +3782,8 @@
         <w:t xml:space="preserve">: B1 (CHAL-COVER-001), C1 (TMX-T5), C2 (TMX-T7), C3 (TMX-T8), D1 (TOPO-DISPATCH-001) moved to Fixed.md.</w:t>
       </w:r>
     </w:p>
-    <w:bookmarkEnd w:id="23"/>
-    <w:bookmarkStart w:id="25" w:name="Xa47a1f2e6aab857c5ebcc9727ef871a96653e0e"/>
+    <w:bookmarkEnd w:id="24"/>
+    <w:bookmarkStart w:id="26" w:name="Xa47a1f2e6aab857c5ebcc9727ef871a96653e0e"/>
     <w:p>
       <w:pPr>
         <w:pStyle w:val="Heading3"/>
@@ -4550,7 +4743,7 @@
       <w:r>
         <w:t xml:space="preserve"> </w:t>
       </w:r>
-      <w:hyperlink r:id="rId24">
+      <w:hyperlink r:id="rId25">
         <w:r>
           <w:rPr>
             <w:rStyle w:val="VerbatimChar"/>
@@ -7066,8 +7259,8 @@
         <w:t xml:space="preserve">itself is a §12.10 / §11.4.6 violation — opaque commit message, silent submodule mutation, no CONTINUATION update. Cannot rewrite history per §9 data safety; documenting here is the audit trail.</w:t>
       </w:r>
     </w:p>
-    <w:bookmarkEnd w:id="25"/>
-    <w:bookmarkStart w:id="26" w:name="X39a6c66e0be7f50e7d32ecd13d50cf753d128a7"/>
+    <w:bookmarkEnd w:id="26"/>
+    <w:bookmarkStart w:id="27" w:name="X39a6c66e0be7f50e7d32ecd13d50cf753d128a7"/>
     <w:p>
       <w:pPr>
         <w:pStyle w:val="Heading3"/>
@@ -7401,8 +7594,8 @@
         <w:t xml:space="preserve">§3.6: removed stale "remaining open" note.</w:t>
       </w:r>
     </w:p>
-    <w:bookmarkEnd w:id="26"/>
-    <w:bookmarkStart w:id="27" w:name="X2726eb1fde9d0d5c4232a8af5bb29bc2efcb6ea"/>
+    <w:bookmarkEnd w:id="27"/>
+    <w:bookmarkStart w:id="28" w:name="X2726eb1fde9d0d5c4232a8af5bb29bc2efcb6ea"/>
     <w:p>
       <w:pPr>
         <w:pStyle w:val="Heading3"/>
@@ -8377,8 +8570,8 @@
         <w:t xml:space="preserve">all work").</w:t>
       </w:r>
     </w:p>
-    <w:bookmarkEnd w:id="27"/>
-    <w:bookmarkStart w:id="28" w:name="X50530f0d3163508b53d4e1446abd0230469972a"/>
+    <w:bookmarkEnd w:id="28"/>
+    <w:bookmarkStart w:id="29" w:name="X50530f0d3163508b53d4e1446abd0230469972a"/>
     <w:p>
       <w:pPr>
         <w:pStyle w:val="Heading3"/>
@@ -9106,8 +9299,8 @@
         <w:t xml:space="preserve">headless).</w:t>
       </w:r>
     </w:p>
-    <w:bookmarkEnd w:id="28"/>
-    <w:bookmarkStart w:id="29" w:name="Xb6dc7ed3ec66a5d998e26a7e8534471ca2cc3e0"/>
+    <w:bookmarkEnd w:id="29"/>
+    <w:bookmarkStart w:id="30" w:name="Xb6dc7ed3ec66a5d998e26a7e8534471ca2cc3e0"/>
     <w:p>
       <w:pPr>
         <w:pStyle w:val="Heading3"/>
@@ -9547,8 +9740,8 @@
         <w:t xml:space="preserve">"Make sure we setup the new version once all done." directive.</w:t>
       </w:r>
     </w:p>
-    <w:bookmarkEnd w:id="29"/>
-    <w:bookmarkStart w:id="30" w:name="Xd3af410912ca3cafb170fb407cc411bb8aa2631"/>
+    <w:bookmarkEnd w:id="30"/>
+    <w:bookmarkStart w:id="31" w:name="Xd3af410912ca3cafb170fb407cc411bb8aa2631"/>
     <w:p>
       <w:pPr>
         <w:pStyle w:val="Heading3"/>
@@ -9971,8 +10164,8 @@
         <w:t xml:space="preserve">as deferred post-release smoke.</w:t>
       </w:r>
     </w:p>
-    <w:bookmarkEnd w:id="30"/>
-    <w:bookmarkStart w:id="31" w:name="Xd334663f66da9fbc338b039ddad8ed42ad07243"/>
+    <w:bookmarkEnd w:id="31"/>
+    <w:bookmarkStart w:id="32" w:name="Xd334663f66da9fbc338b039ddad8ed42ad07243"/>
     <w:p>
       <w:pPr>
         <w:pStyle w:val="Heading3"/>
@@ -10449,8 +10642,8 @@
         <w:t xml:space="preserve">preceded the tag; no spot-check shortcut).</w:t>
       </w:r>
     </w:p>
-    <w:bookmarkEnd w:id="31"/>
-    <w:bookmarkStart w:id="32" w:name="Xd55c57cd252c85ec7bdcd4b23e73cec6cfc2cd4"/>
+    <w:bookmarkEnd w:id="32"/>
+    <w:bookmarkStart w:id="33" w:name="Xd55c57cd252c85ec7bdcd4b23e73cec6cfc2cd4"/>
     <w:p>
       <w:pPr>
         <w:pStyle w:val="Heading3"/>
@@ -11521,8 +11714,8 @@
         <w:t xml:space="preserve">tests 09/13/14 alongside the Darwin branches running today.</w:t>
       </w:r>
     </w:p>
-    <w:bookmarkEnd w:id="32"/>
-    <w:bookmarkStart w:id="33" w:name="X572a5be484f72dd1209250eb21ec3b6cad7931d"/>
+    <w:bookmarkEnd w:id="33"/>
+    <w:bookmarkStart w:id="34" w:name="X572a5be484f72dd1209250eb21ec3b6cad7931d"/>
     <w:p>
       <w:pPr>
         <w:pStyle w:val="Heading3"/>
@@ -12470,8 +12663,8 @@
         <w:t xml:space="preserve">topology-correct), e2e 9/0/0.</w:t>
       </w:r>
     </w:p>
-    <w:bookmarkEnd w:id="33"/>
-    <w:bookmarkStart w:id="34" w:name="Xdc1f843cc4a7cc6c48cb008be32d2d72d9f426c"/>
+    <w:bookmarkEnd w:id="34"/>
+    <w:bookmarkStart w:id="35" w:name="Xdc1f843cc4a7cc6c48cb008be32d2d72d9f426c"/>
     <w:p>
       <w:pPr>
         <w:pStyle w:val="Heading3"/>
@@ -13080,9 +13273,9 @@
         <w:t xml:space="preserve">GREEN, suite PASS=13/0/SKIP=5, meta-test 18/0/6, e2e 9/0/0.</w:t>
       </w:r>
     </w:p>
-    <w:bookmarkEnd w:id="34"/>
     <w:bookmarkEnd w:id="35"/>
-    <w:bookmarkStart w:id="36" w:name="Xf9daad60751079e769ca58715403a214307050f"/>
+    <w:bookmarkEnd w:id="36"/>
+    <w:bookmarkStart w:id="37" w:name="Xf9daad60751079e769ca58715403a214307050f"/>
     <w:p>
       <w:pPr>
         <w:pStyle w:val="Heading2"/>
@@ -13724,8 +13917,8 @@
         <w:t xml:space="preserve">(2026-05-07) — Initial vasic-digital/tmux: migrated from ATMOSphere project + per-session containerization plan + 8-test verification gate.</w:t>
       </w:r>
     </w:p>
-    <w:bookmarkEnd w:id="36"/>
-    <w:bookmarkStart w:id="37" w:name="X6eb44e94951e80621b9fe10f2f53b34d95aee13"/>
+    <w:bookmarkEnd w:id="37"/>
+    <w:bookmarkStart w:id="38" w:name="X6eb44e94951e80621b9fe10f2f53b34d95aee13"/>
     <w:p>
       <w:pPr>
         <w:pStyle w:val="Heading2"/>
@@ -13854,8 +14047,8 @@
         <w:t xml:space="preserve">Update this document in the SAME commit as the work itself (§12.10 invariant)</w:t>
       </w:r>
     </w:p>
-    <w:bookmarkEnd w:id="37"/>
     <w:bookmarkEnd w:id="38"/>
+    <w:bookmarkEnd w:id="39"/>
     <w:sectPr>
       <w:footnotePr>
         <w:numRestart w:val="eachSect"/>

</xml_diff>

<commit_message>
v1.0.19 post-release CONTINUATION sync — §3.19 RELEASED (GitHub + GitLab live), full retest at release commit c5235f8 GREEN both hosts.
Signed-off-by: Milos Vasic <i@mvasic.ru>
</commit_message>
<xml_diff>
--- a/CONTINUATION.docx
+++ b/CONTINUATION.docx
@@ -10,7 +10,7 @@
         <w:t xml:space="preserve">CONTINUATION</w:t>
       </w:r>
     </w:p>
-    <w:bookmarkStart w:id="39" w:name="continuationmd--vasic-digital-tmux"/>
+    <w:bookmarkStart w:id="41" w:name="continuationmd--vasic-digital-tmux"/>
     <w:p>
       <w:pPr>
         <w:pStyle w:val="Heading1"/>
@@ -34,7 +34,7 @@
         <w:t xml:space="preserve"> </w:t>
       </w:r>
       <w:r>
-        <w:t xml:space="preserve">2026-05-29T13:30Z</w:t>
+        <w:t xml:space="preserve">2026-05-29T13:55Z</w:t>
       </w:r>
     </w:p>
     <w:bookmarkStart w:id="9" w:name="X46e2b1e0ed863e0637bb3aab0aa22fad9aaafec"/>
@@ -930,7 +930,7 @@
       </w:r>
     </w:p>
     <w:bookmarkEnd w:id="11"/>
-    <w:bookmarkStart w:id="36" w:name="X9bbd2c3048cfbd7ee7622f0d2295634d9b66aad"/>
+    <w:bookmarkStart w:id="38" w:name="X9bbd2c3048cfbd7ee7622f0d2295634d9b66aad"/>
     <w:p>
       <w:pPr>
         <w:pStyle w:val="Heading2"/>
@@ -939,13 +939,13 @@
         <w:t xml:space="preserve">§3 — Active work</w:t>
       </w:r>
     </w:p>
-    <w:bookmarkStart w:id="12" w:name="Xffeb255c07f7fe8250572ddb15b59dcaf62972a"/>
+    <w:bookmarkStart w:id="14" w:name="X28f5989dbd72dc834b9cc20776f8d10676b27f0"/>
     <w:p>
       <w:pPr>
         <w:pStyle w:val="Heading3"/>
       </w:pPr>
       <w:r>
-        <w:t xml:space="preserve">§3.19 — Dual-host update to latest HEAD + full test/verify (2026-05-29)</w:t>
+        <w:t xml:space="preserve">§3.19 — Dual-host update + full test/verify + v1.0.19 release (2026-05-29)</w:t>
       </w:r>
     </w:p>
     <w:p>
@@ -963,22 +963,50 @@
         <w:t xml:space="preserve"> </w:t>
       </w:r>
       <w:r>
-        <w:t xml:space="preserve">DONE. Both hosts pulled to HEAD</w:t>
-      </w:r>
-      <w:r>
-        <w:t xml:space="preserve"> </w:t>
-      </w:r>
-      <w:r>
-        <w:rPr>
-          <w:rStyle w:val="VerbatimChar"/>
-        </w:rPr>
-        <w:t xml:space="preserve">a0a3f85</w:t>
-      </w:r>
-      <w:r>
-        <w:t xml:space="preserve"> </w:t>
-      </w:r>
-      <w:r>
-        <w:t xml:space="preserve">and fully verified.</w:t>
+        <w:t xml:space="preserve">DONE — RELEASED v1.0.19 (2026-05-29). GitHub:</w:t>
+      </w:r>
+      <w:r>
+        <w:t xml:space="preserve"> </w:t>
+      </w:r>
+      <w:hyperlink r:id="rId12">
+        <w:r>
+          <w:rPr>
+            <w:rStyle w:val="Hyperlink"/>
+          </w:rPr>
+          <w:t xml:space="preserve">https://github.com/vasic-digital/tmux/releases/tag/v1.0.19</w:t>
+        </w:r>
+      </w:hyperlink>
+      <w:r>
+        <w:t xml:space="preserve"> </w:t>
+      </w:r>
+      <w:r>
+        <w:t xml:space="preserve">· GitLab:</w:t>
+      </w:r>
+      <w:r>
+        <w:t xml:space="preserve"> </w:t>
+      </w:r>
+      <w:hyperlink r:id="rId13">
+        <w:r>
+          <w:rPr>
+            <w:rStyle w:val="Hyperlink"/>
+          </w:rPr>
+          <w:t xml:space="preserve">https://gitlab.com/vasic-digital/tmux/-/releases/v1.0.19</w:t>
+        </w:r>
+      </w:hyperlink>
+      <w:r>
+        <w:t xml:space="preserve">. §11.4.40 full retest at the release commit</w:t>
+      </w:r>
+      <w:r>
+        <w:t xml:space="preserve"> </w:t>
+      </w:r>
+      <w:r>
+        <w:rPr>
+          <w:rStyle w:val="VerbatimChar"/>
+        </w:rPr>
+        <w:t xml:space="preserve">c5235f8</w:t>
+      </w:r>
+      <w:r>
+        <w:t xml:space="preserve">: Mistborn run_all 51/0/4 + meta 48/0; nezha run_all 43/0/12 + meta 48/0; M22 CAUGHT on both. v1.0.19 = the codegraph non-interactive PATH probe in run_all + meta-test (no product/runtime change). Both hosts verified at the release commit.</w:t>
       </w:r>
       <w:r>
         <w:t xml:space="preserve"> </w:t>
@@ -1131,8 +1159,8 @@
         <w:t xml:space="preserve">did not recur this round.</w:t>
       </w:r>
     </w:p>
-    <w:bookmarkEnd w:id="12"/>
-    <w:bookmarkStart w:id="15" w:name="X355fc9a1cf777007644228a932aa130e2c8e704"/>
+    <w:bookmarkEnd w:id="14"/>
+    <w:bookmarkStart w:id="17" w:name="X355fc9a1cf777007644228a932aa130e2c8e704"/>
     <w:p>
       <w:pPr>
         <w:pStyle w:val="Heading3"/>
@@ -1161,7 +1189,7 @@
       <w:r>
         <w:t xml:space="preserve"> </w:t>
       </w:r>
-      <w:hyperlink r:id="rId13">
+      <w:hyperlink r:id="rId15">
         <w:r>
           <w:rPr>
             <w:rStyle w:val="Hyperlink"/>
@@ -1178,7 +1206,7 @@
       <w:r>
         <w:t xml:space="preserve"> </w:t>
       </w:r>
-      <w:hyperlink r:id="rId14">
+      <w:hyperlink r:id="rId16">
         <w:r>
           <w:rPr>
             <w:rStyle w:val="Hyperlink"/>
@@ -1400,8 +1428,8 @@
         <w:t xml:space="preserve">(refresh ~/.tmux.conf), nezha headless test-56 proof, v1.0.18 release.</w:t>
       </w:r>
     </w:p>
-    <w:bookmarkEnd w:id="15"/>
-    <w:bookmarkStart w:id="18" w:name="Xebab2c91518890b5812c0749bb46435dd248681"/>
+    <w:bookmarkEnd w:id="17"/>
+    <w:bookmarkStart w:id="20" w:name="Xebab2c91518890b5812c0749bb46435dd248681"/>
     <w:p>
       <w:pPr>
         <w:pStyle w:val="Heading3"/>
@@ -1430,7 +1458,7 @@
       <w:r>
         <w:t xml:space="preserve"> </w:t>
       </w:r>
-      <w:hyperlink r:id="rId16">
+      <w:hyperlink r:id="rId18">
         <w:r>
           <w:rPr>
             <w:rStyle w:val="Hyperlink"/>
@@ -1447,7 +1475,7 @@
       <w:r>
         <w:t xml:space="preserve"> </w:t>
       </w:r>
-      <w:hyperlink r:id="rId17">
+      <w:hyperlink r:id="rId19">
         <w:r>
           <w:rPr>
             <w:rStyle w:val="Hyperlink"/>
@@ -1913,8 +1941,8 @@
         <w:t xml:space="preserve">both-host evidence, VERSION bump (1.0.17/18), gh+glab release.</w:t>
       </w:r>
     </w:p>
-    <w:bookmarkEnd w:id="18"/>
-    <w:bookmarkStart w:id="19" w:name="X4bf7be095085477ec4195c5ea33259b03408111"/>
+    <w:bookmarkEnd w:id="20"/>
+    <w:bookmarkStart w:id="21" w:name="X4bf7be095085477ec4195c5ea33259b03408111"/>
     <w:p>
       <w:pPr>
         <w:pStyle w:val="Heading3"/>
@@ -2229,8 +2257,8 @@
         <w:t xml:space="preserve">to carry every numbered anchor + canonical-authority cross-references</w:t>
       </w:r>
     </w:p>
-    <w:bookmarkEnd w:id="19"/>
-    <w:bookmarkStart w:id="20" w:name="X9597a4ec2f18a9b28ff1f606dbcb4fc46cb4e4b"/>
+    <w:bookmarkEnd w:id="21"/>
+    <w:bookmarkStart w:id="22" w:name="X9597a4ec2f18a9b28ff1f606dbcb4fc46cb4e4b"/>
     <w:p>
       <w:pPr>
         <w:pStyle w:val="Heading3"/>
@@ -2593,8 +2621,8 @@
         <w:t xml:space="preserve">3 concurrent scopes, all registered + active simultaneously ✓</w:t>
       </w:r>
     </w:p>
-    <w:bookmarkEnd w:id="20"/>
-    <w:bookmarkStart w:id="21" w:name="X06cb01c5625e5cfa81a37477bd54d4d45671fdf"/>
+    <w:bookmarkEnd w:id="22"/>
+    <w:bookmarkStart w:id="23" w:name="X06cb01c5625e5cfa81a37477bd54d4d45671fdf"/>
     <w:p>
       <w:pPr>
         <w:pStyle w:val="Heading3"/>
@@ -2775,8 +2803,8 @@
         <w:t xml:space="preserve">— Issues.md D1 (formal topology dispatch matrix)</w:t>
       </w:r>
     </w:p>
-    <w:bookmarkEnd w:id="21"/>
-    <w:bookmarkStart w:id="22" w:name="X6dbba4eb95812a90f20c800e44eb5a6a7358d51"/>
+    <w:bookmarkEnd w:id="23"/>
+    <w:bookmarkStart w:id="24" w:name="X6dbba4eb95812a90f20c800e44eb5a6a7358d51"/>
     <w:p>
       <w:pPr>
         <w:pStyle w:val="Heading3"/>
@@ -3124,8 +3152,8 @@
         <w:t xml:space="preserve">B2.</w:t>
       </w:r>
     </w:p>
-    <w:bookmarkEnd w:id="22"/>
-    <w:bookmarkStart w:id="23" w:name="Xb35b1f3f7dabbb428c448451ce7167cbe2cd4e6"/>
+    <w:bookmarkEnd w:id="24"/>
+    <w:bookmarkStart w:id="25" w:name="Xb35b1f3f7dabbb428c448451ce7167cbe2cd4e6"/>
     <w:p>
       <w:pPr>
         <w:pStyle w:val="Heading3"/>
@@ -3455,8 +3483,8 @@
         <w:t xml:space="preserve">— bump test count from 9 to 11.</w:t>
       </w:r>
     </w:p>
-    <w:bookmarkEnd w:id="23"/>
-    <w:bookmarkStart w:id="24" w:name="X2dea41730e11114ce2f1f24a9ac20830f0c6d8c"/>
+    <w:bookmarkEnd w:id="25"/>
+    <w:bookmarkStart w:id="26" w:name="X2dea41730e11114ce2f1f24a9ac20830f0c6d8c"/>
     <w:p>
       <w:pPr>
         <w:pStyle w:val="Heading3"/>
@@ -3782,8 +3810,8 @@
         <w:t xml:space="preserve">: B1 (CHAL-COVER-001), C1 (TMX-T5), C2 (TMX-T7), C3 (TMX-T8), D1 (TOPO-DISPATCH-001) moved to Fixed.md.</w:t>
       </w:r>
     </w:p>
-    <w:bookmarkEnd w:id="24"/>
-    <w:bookmarkStart w:id="26" w:name="Xa47a1f2e6aab857c5ebcc9727ef871a96653e0e"/>
+    <w:bookmarkEnd w:id="26"/>
+    <w:bookmarkStart w:id="28" w:name="Xa47a1f2e6aab857c5ebcc9727ef871a96653e0e"/>
     <w:p>
       <w:pPr>
         <w:pStyle w:val="Heading3"/>
@@ -4743,7 +4771,7 @@
       <w:r>
         <w:t xml:space="preserve"> </w:t>
       </w:r>
-      <w:hyperlink r:id="rId25">
+      <w:hyperlink r:id="rId27">
         <w:r>
           <w:rPr>
             <w:rStyle w:val="VerbatimChar"/>
@@ -7259,8 +7287,8 @@
         <w:t xml:space="preserve">itself is a §12.10 / §11.4.6 violation — opaque commit message, silent submodule mutation, no CONTINUATION update. Cannot rewrite history per §9 data safety; documenting here is the audit trail.</w:t>
       </w:r>
     </w:p>
-    <w:bookmarkEnd w:id="26"/>
-    <w:bookmarkStart w:id="27" w:name="X39a6c66e0be7f50e7d32ecd13d50cf753d128a7"/>
+    <w:bookmarkEnd w:id="28"/>
+    <w:bookmarkStart w:id="29" w:name="X39a6c66e0be7f50e7d32ecd13d50cf753d128a7"/>
     <w:p>
       <w:pPr>
         <w:pStyle w:val="Heading3"/>
@@ -7594,8 +7622,8 @@
         <w:t xml:space="preserve">§3.6: removed stale "remaining open" note.</w:t>
       </w:r>
     </w:p>
-    <w:bookmarkEnd w:id="27"/>
-    <w:bookmarkStart w:id="28" w:name="X2726eb1fde9d0d5c4232a8af5bb29bc2efcb6ea"/>
+    <w:bookmarkEnd w:id="29"/>
+    <w:bookmarkStart w:id="30" w:name="X2726eb1fde9d0d5c4232a8af5bb29bc2efcb6ea"/>
     <w:p>
       <w:pPr>
         <w:pStyle w:val="Heading3"/>
@@ -8570,8 +8598,8 @@
         <w:t xml:space="preserve">all work").</w:t>
       </w:r>
     </w:p>
-    <w:bookmarkEnd w:id="28"/>
-    <w:bookmarkStart w:id="29" w:name="X50530f0d3163508b53d4e1446abd0230469972a"/>
+    <w:bookmarkEnd w:id="30"/>
+    <w:bookmarkStart w:id="31" w:name="X50530f0d3163508b53d4e1446abd0230469972a"/>
     <w:p>
       <w:pPr>
         <w:pStyle w:val="Heading3"/>
@@ -9299,8 +9327,8 @@
         <w:t xml:space="preserve">headless).</w:t>
       </w:r>
     </w:p>
-    <w:bookmarkEnd w:id="29"/>
-    <w:bookmarkStart w:id="30" w:name="Xb6dc7ed3ec66a5d998e26a7e8534471ca2cc3e0"/>
+    <w:bookmarkEnd w:id="31"/>
+    <w:bookmarkStart w:id="32" w:name="Xb6dc7ed3ec66a5d998e26a7e8534471ca2cc3e0"/>
     <w:p>
       <w:pPr>
         <w:pStyle w:val="Heading3"/>
@@ -9740,8 +9768,8 @@
         <w:t xml:space="preserve">"Make sure we setup the new version once all done." directive.</w:t>
       </w:r>
     </w:p>
-    <w:bookmarkEnd w:id="30"/>
-    <w:bookmarkStart w:id="31" w:name="Xd3af410912ca3cafb170fb407cc411bb8aa2631"/>
+    <w:bookmarkEnd w:id="32"/>
+    <w:bookmarkStart w:id="33" w:name="Xd3af410912ca3cafb170fb407cc411bb8aa2631"/>
     <w:p>
       <w:pPr>
         <w:pStyle w:val="Heading3"/>
@@ -10164,8 +10192,8 @@
         <w:t xml:space="preserve">as deferred post-release smoke.</w:t>
       </w:r>
     </w:p>
-    <w:bookmarkEnd w:id="31"/>
-    <w:bookmarkStart w:id="32" w:name="Xd334663f66da9fbc338b039ddad8ed42ad07243"/>
+    <w:bookmarkEnd w:id="33"/>
+    <w:bookmarkStart w:id="34" w:name="Xd334663f66da9fbc338b039ddad8ed42ad07243"/>
     <w:p>
       <w:pPr>
         <w:pStyle w:val="Heading3"/>
@@ -10642,8 +10670,8 @@
         <w:t xml:space="preserve">preceded the tag; no spot-check shortcut).</w:t>
       </w:r>
     </w:p>
-    <w:bookmarkEnd w:id="32"/>
-    <w:bookmarkStart w:id="33" w:name="Xd55c57cd252c85ec7bdcd4b23e73cec6cfc2cd4"/>
+    <w:bookmarkEnd w:id="34"/>
+    <w:bookmarkStart w:id="35" w:name="Xd55c57cd252c85ec7bdcd4b23e73cec6cfc2cd4"/>
     <w:p>
       <w:pPr>
         <w:pStyle w:val="Heading3"/>
@@ -11714,8 +11742,8 @@
         <w:t xml:space="preserve">tests 09/13/14 alongside the Darwin branches running today.</w:t>
       </w:r>
     </w:p>
-    <w:bookmarkEnd w:id="33"/>
-    <w:bookmarkStart w:id="34" w:name="X572a5be484f72dd1209250eb21ec3b6cad7931d"/>
+    <w:bookmarkEnd w:id="35"/>
+    <w:bookmarkStart w:id="36" w:name="X572a5be484f72dd1209250eb21ec3b6cad7931d"/>
     <w:p>
       <w:pPr>
         <w:pStyle w:val="Heading3"/>
@@ -12663,8 +12691,8 @@
         <w:t xml:space="preserve">topology-correct), e2e 9/0/0.</w:t>
       </w:r>
     </w:p>
-    <w:bookmarkEnd w:id="34"/>
-    <w:bookmarkStart w:id="35" w:name="Xdc1f843cc4a7cc6c48cb008be32d2d72d9f426c"/>
+    <w:bookmarkEnd w:id="36"/>
+    <w:bookmarkStart w:id="37" w:name="Xdc1f843cc4a7cc6c48cb008be32d2d72d9f426c"/>
     <w:p>
       <w:pPr>
         <w:pStyle w:val="Heading3"/>
@@ -13273,9 +13301,9 @@
         <w:t xml:space="preserve">GREEN, suite PASS=13/0/SKIP=5, meta-test 18/0/6, e2e 9/0/0.</w:t>
       </w:r>
     </w:p>
-    <w:bookmarkEnd w:id="35"/>
-    <w:bookmarkEnd w:id="36"/>
-    <w:bookmarkStart w:id="37" w:name="Xf9daad60751079e769ca58715403a214307050f"/>
+    <w:bookmarkEnd w:id="37"/>
+    <w:bookmarkEnd w:id="38"/>
+    <w:bookmarkStart w:id="39" w:name="Xf9daad60751079e769ca58715403a214307050f"/>
     <w:p>
       <w:pPr>
         <w:pStyle w:val="Heading2"/>
@@ -13917,8 +13945,8 @@
         <w:t xml:space="preserve">(2026-05-07) — Initial vasic-digital/tmux: migrated from ATMOSphere project + per-session containerization plan + 8-test verification gate.</w:t>
       </w:r>
     </w:p>
-    <w:bookmarkEnd w:id="37"/>
-    <w:bookmarkStart w:id="38" w:name="X6eb44e94951e80621b9fe10f2f53b34d95aee13"/>
+    <w:bookmarkEnd w:id="39"/>
+    <w:bookmarkStart w:id="40" w:name="X6eb44e94951e80621b9fe10f2f53b34d95aee13"/>
     <w:p>
       <w:pPr>
         <w:pStyle w:val="Heading2"/>
@@ -14047,8 +14075,8 @@
         <w:t xml:space="preserve">Update this document in the SAME commit as the work itself (§12.10 invariant)</w:t>
       </w:r>
     </w:p>
-    <w:bookmarkEnd w:id="38"/>
-    <w:bookmarkEnd w:id="39"/>
+    <w:bookmarkEnd w:id="40"/>
+    <w:bookmarkEnd w:id="41"/>
     <w:sectPr>
       <w:footnotePr>
         <w:numRestart w:val="eachSect"/>

</xml_diff>

<commit_message>
v1.0.20 — paste fix (POSIX prefix-P) + tmx reload + tmx attach auto-reload (stale-session root cause) + real-mouse tests 57/58. Operator-confirmed: drag-select + Cmd-V pastes selected content. VERSION 1.0.20/21 + CHANGELOG + docs/changelogs/v1.0.20.md + CONTINUATION §3.20.
Signed-off-by: Milos Vasic <i@mvasic.ru>
</commit_message>
<xml_diff>
--- a/CONTINUATION.docx
+++ b/CONTINUATION.docx
@@ -34,7 +34,7 @@
         <w:t xml:space="preserve"> </w:t>
       </w:r>
       <w:r>
-        <w:t xml:space="preserve">2026-05-29T15:20Z</w:t>
+        <w:t xml:space="preserve">2026-05-29T16:35Z</w:t>
       </w:r>
     </w:p>
     <w:bookmarkStart w:id="9" w:name="X46e2b1e0ed863e0637bb3aab0aa22fad9aaafec"/>
@@ -939,13 +939,13 @@
         <w:t xml:space="preserve">§3 — Active work</w:t>
       </w:r>
     </w:p>
-    <w:bookmarkStart w:id="12" w:name="X081c2c8958e6965f0d1f0d21e14ac94fc0e5e72"/>
+    <w:bookmarkStart w:id="12" w:name="X25af542b0f0a7d96335459fc8710c74d859226a"/>
     <w:p>
       <w:pPr>
         <w:pStyle w:val="Heading3"/>
       </w:pPr>
       <w:r>
-        <w:t xml:space="preserve">§3.20 — tmux PASTE fix + tmx reload + Mistborn install/validate (2026-05-29)</w:t>
+        <w:t xml:space="preserve">§3.20 — tmux PASTE fix + tmx reload + attach-reload → v1.0.20 (2026-05-29)</w:t>
       </w:r>
     </w:p>
     <w:p>
@@ -963,7 +963,61 @@
         <w:t xml:space="preserve"> </w:t>
       </w:r>
       <w:r>
-        <w:t xml:space="preserve">Mistborn DONE; nezha PENDING operator manual-validation gate.</w:t>
+        <w:t xml:space="preserve">RESOLVED + operator-confirmed (drag-select + Cmd-V pastes the</w:t>
+      </w:r>
+      <w:r>
+        <w:t xml:space="preserve"> </w:t>
+      </w:r>
+      <w:r>
+        <w:t xml:space="preserve">selected content). Releasing v1.0.20; dual-host setup/validate in progress.</w:t>
+      </w:r>
+      <w:r>
+        <w:t xml:space="preserve"> </w:t>
+      </w:r>
+      <w:r>
+        <w:t xml:space="preserve">Root cause of the long copy/paste saga: a tmux server loads config only at</w:t>
+      </w:r>
+      <w:r>
+        <w:t xml:space="preserve"> </w:t>
+      </w:r>
+      <w:r>
+        <w:t xml:space="preserve">startup, so re-opened long-lived sessions kept stale bindings — fixed by</w:t>
+      </w:r>
+      <w:r>
+        <w:t xml:space="preserve"> </w:t>
+      </w:r>
+      <w:r>
+        <w:rPr>
+          <w:rStyle w:val="VerbatimChar"/>
+        </w:rPr>
+        <w:t xml:space="preserve">tmx attach</w:t>
+      </w:r>
+      <w:r>
+        <w:t xml:space="preserve"> </w:t>
+      </w:r>
+      <w:r>
+        <w:t xml:space="preserve">auto-reload +</w:t>
+      </w:r>
+      <w:r>
+        <w:t xml:space="preserve"> </w:t>
+      </w:r>
+      <w:r>
+        <w:rPr>
+          <w:rStyle w:val="VerbatimChar"/>
+        </w:rPr>
+        <w:t xml:space="preserve">tmx reload</w:t>
+      </w:r>
+      <w:r>
+        <w:t xml:space="preserve"> </w:t>
+      </w:r>
+      <w:r>
+        <w:t xml:space="preserve">+ plain-drag override + POSIX paste</w:t>
+      </w:r>
+      <w:r>
+        <w:t xml:space="preserve"> </w:t>
+      </w:r>
+      <w:r>
+        <w:t xml:space="preserve">binding. Tests 56/57/58 (real-mouse SGR + clipboard) + meta 50/0.</w:t>
       </w:r>
     </w:p>
     <w:p>

</xml_diff>

<commit_message>
v1.0.20 post-release CONTINUATION sync — §3.20 RELEASED (GitHub + GitLab live), dual-host validated at 0205b44 (Mistborn 53/0/4 + meta 50/0; nezha 44/0/13).
Signed-off-by: Milos Vasic <i@mvasic.ru>
</commit_message>
<xml_diff>
--- a/CONTINUATION.docx
+++ b/CONTINUATION.docx
@@ -10,7 +10,7 @@
         <w:t xml:space="preserve">CONTINUATION</w:t>
       </w:r>
     </w:p>
-    <w:bookmarkStart w:id="42" w:name="continuationmd--vasic-digital-tmux"/>
+    <w:bookmarkStart w:id="44" w:name="continuationmd--vasic-digital-tmux"/>
     <w:p>
       <w:pPr>
         <w:pStyle w:val="Heading1"/>
@@ -34,7 +34,7 @@
         <w:t xml:space="preserve"> </w:t>
       </w:r>
       <w:r>
-        <w:t xml:space="preserve">2026-05-29T16:35Z</w:t>
+        <w:t xml:space="preserve">2026-05-29T16:55Z</w:t>
       </w:r>
     </w:p>
     <w:bookmarkStart w:id="9" w:name="X46e2b1e0ed863e0637bb3aab0aa22fad9aaafec"/>
@@ -930,7 +930,7 @@
       </w:r>
     </w:p>
     <w:bookmarkEnd w:id="11"/>
-    <w:bookmarkStart w:id="39" w:name="X9bbd2c3048cfbd7ee7622f0d2295634d9b66aad"/>
+    <w:bookmarkStart w:id="41" w:name="X9bbd2c3048cfbd7ee7622f0d2295634d9b66aad"/>
     <w:p>
       <w:pPr>
         <w:pStyle w:val="Heading2"/>
@@ -939,7 +939,7 @@
         <w:t xml:space="preserve">§3 — Active work</w:t>
       </w:r>
     </w:p>
-    <w:bookmarkStart w:id="12" w:name="X25af542b0f0a7d96335459fc8710c74d859226a"/>
+    <w:bookmarkStart w:id="14" w:name="X25af542b0f0a7d96335459fc8710c74d859226a"/>
     <w:p>
       <w:pPr>
         <w:pStyle w:val="Heading3"/>
@@ -963,13 +963,38 @@
         <w:t xml:space="preserve"> </w:t>
       </w:r>
       <w:r>
-        <w:t xml:space="preserve">RESOLVED + operator-confirmed (drag-select + Cmd-V pastes the</w:t>
-      </w:r>
-      <w:r>
-        <w:t xml:space="preserve"> </w:t>
-      </w:r>
-      <w:r>
-        <w:t xml:space="preserve">selected content). Releasing v1.0.20; dual-host setup/validate in progress.</w:t>
+        <w:t xml:space="preserve">DONE — RELEASED v1.0.20 (2026-05-29). GitHub:</w:t>
+      </w:r>
+      <w:r>
+        <w:t xml:space="preserve"> </w:t>
+      </w:r>
+      <w:hyperlink r:id="rId12">
+        <w:r>
+          <w:rPr>
+            <w:rStyle w:val="Hyperlink"/>
+          </w:rPr>
+          <w:t xml:space="preserve">https://github.com/vasic-digital/tmux/releases/tag/v1.0.20</w:t>
+        </w:r>
+      </w:hyperlink>
+      <w:r>
+        <w:t xml:space="preserve"> </w:t>
+      </w:r>
+      <w:r>
+        <w:t xml:space="preserve">· GitLab:</w:t>
+      </w:r>
+      <w:r>
+        <w:t xml:space="preserve"> </w:t>
+      </w:r>
+      <w:hyperlink r:id="rId13">
+        <w:r>
+          <w:rPr>
+            <w:rStyle w:val="Hyperlink"/>
+          </w:rPr>
+          <w:t xml:space="preserve">https://gitlab.com/vasic-digital/tmux/-/releases/v1.0.20</w:t>
+        </w:r>
+      </w:hyperlink>
+      <w:r>
+        <w:t xml:space="preserve">. Operator-confirmed (drag-select + Cmd-V pastes selected content). Dual-host validated at release commit 0205b44: Mistborn run_all 53/0/4 + meta 50/0; nezha run_all 44/0/13 + test 58 PASS.</w:t>
       </w:r>
       <w:r>
         <w:t xml:space="preserve"> </w:t>
@@ -1356,8 +1381,8 @@
         <w:t xml:space="preserve">session; THEN nezha setup + validation; THEN next release.</w:t>
       </w:r>
     </w:p>
-    <w:bookmarkEnd w:id="12"/>
-    <w:bookmarkStart w:id="15" w:name="X28f5989dbd72dc834b9cc20776f8d10676b27f0"/>
+    <w:bookmarkEnd w:id="14"/>
+    <w:bookmarkStart w:id="17" w:name="X28f5989dbd72dc834b9cc20776f8d10676b27f0"/>
     <w:p>
       <w:pPr>
         <w:pStyle w:val="Heading3"/>
@@ -1386,7 +1411,7 @@
       <w:r>
         <w:t xml:space="preserve"> </w:t>
       </w:r>
-      <w:hyperlink r:id="rId13">
+      <w:hyperlink r:id="rId15">
         <w:r>
           <w:rPr>
             <w:rStyle w:val="Hyperlink"/>
@@ -1403,7 +1428,7 @@
       <w:r>
         <w:t xml:space="preserve"> </w:t>
       </w:r>
-      <w:hyperlink r:id="rId14">
+      <w:hyperlink r:id="rId16">
         <w:r>
           <w:rPr>
             <w:rStyle w:val="Hyperlink"/>
@@ -1577,8 +1602,8 @@
         <w:t xml:space="preserve">did not recur this round.</w:t>
       </w:r>
     </w:p>
-    <w:bookmarkEnd w:id="15"/>
-    <w:bookmarkStart w:id="18" w:name="X355fc9a1cf777007644228a932aa130e2c8e704"/>
+    <w:bookmarkEnd w:id="17"/>
+    <w:bookmarkStart w:id="20" w:name="X355fc9a1cf777007644228a932aa130e2c8e704"/>
     <w:p>
       <w:pPr>
         <w:pStyle w:val="Heading3"/>
@@ -1607,7 +1632,7 @@
       <w:r>
         <w:t xml:space="preserve"> </w:t>
       </w:r>
-      <w:hyperlink r:id="rId16">
+      <w:hyperlink r:id="rId18">
         <w:r>
           <w:rPr>
             <w:rStyle w:val="Hyperlink"/>
@@ -1624,7 +1649,7 @@
       <w:r>
         <w:t xml:space="preserve"> </w:t>
       </w:r>
-      <w:hyperlink r:id="rId17">
+      <w:hyperlink r:id="rId19">
         <w:r>
           <w:rPr>
             <w:rStyle w:val="Hyperlink"/>
@@ -1846,8 +1871,8 @@
         <w:t xml:space="preserve">(refresh ~/.tmux.conf), nezha headless test-56 proof, v1.0.18 release.</w:t>
       </w:r>
     </w:p>
-    <w:bookmarkEnd w:id="18"/>
-    <w:bookmarkStart w:id="21" w:name="Xebab2c91518890b5812c0749bb46435dd248681"/>
+    <w:bookmarkEnd w:id="20"/>
+    <w:bookmarkStart w:id="23" w:name="Xebab2c91518890b5812c0749bb46435dd248681"/>
     <w:p>
       <w:pPr>
         <w:pStyle w:val="Heading3"/>
@@ -1876,7 +1901,7 @@
       <w:r>
         <w:t xml:space="preserve"> </w:t>
       </w:r>
-      <w:hyperlink r:id="rId19">
+      <w:hyperlink r:id="rId21">
         <w:r>
           <w:rPr>
             <w:rStyle w:val="Hyperlink"/>
@@ -1893,7 +1918,7 @@
       <w:r>
         <w:t xml:space="preserve"> </w:t>
       </w:r>
-      <w:hyperlink r:id="rId20">
+      <w:hyperlink r:id="rId22">
         <w:r>
           <w:rPr>
             <w:rStyle w:val="Hyperlink"/>
@@ -2359,8 +2384,8 @@
         <w:t xml:space="preserve">both-host evidence, VERSION bump (1.0.17/18), gh+glab release.</w:t>
       </w:r>
     </w:p>
-    <w:bookmarkEnd w:id="21"/>
-    <w:bookmarkStart w:id="22" w:name="X4bf7be095085477ec4195c5ea33259b03408111"/>
+    <w:bookmarkEnd w:id="23"/>
+    <w:bookmarkStart w:id="24" w:name="X4bf7be095085477ec4195c5ea33259b03408111"/>
     <w:p>
       <w:pPr>
         <w:pStyle w:val="Heading3"/>
@@ -2675,8 +2700,8 @@
         <w:t xml:space="preserve">to carry every numbered anchor + canonical-authority cross-references</w:t>
       </w:r>
     </w:p>
-    <w:bookmarkEnd w:id="22"/>
-    <w:bookmarkStart w:id="23" w:name="X9597a4ec2f18a9b28ff1f606dbcb4fc46cb4e4b"/>
+    <w:bookmarkEnd w:id="24"/>
+    <w:bookmarkStart w:id="25" w:name="X9597a4ec2f18a9b28ff1f606dbcb4fc46cb4e4b"/>
     <w:p>
       <w:pPr>
         <w:pStyle w:val="Heading3"/>
@@ -3039,8 +3064,8 @@
         <w:t xml:space="preserve">3 concurrent scopes, all registered + active simultaneously ✓</w:t>
       </w:r>
     </w:p>
-    <w:bookmarkEnd w:id="23"/>
-    <w:bookmarkStart w:id="24" w:name="X06cb01c5625e5cfa81a37477bd54d4d45671fdf"/>
+    <w:bookmarkEnd w:id="25"/>
+    <w:bookmarkStart w:id="26" w:name="X06cb01c5625e5cfa81a37477bd54d4d45671fdf"/>
     <w:p>
       <w:pPr>
         <w:pStyle w:val="Heading3"/>
@@ -3221,8 +3246,8 @@
         <w:t xml:space="preserve">— Issues.md D1 (formal topology dispatch matrix)</w:t>
       </w:r>
     </w:p>
-    <w:bookmarkEnd w:id="24"/>
-    <w:bookmarkStart w:id="25" w:name="X6dbba4eb95812a90f20c800e44eb5a6a7358d51"/>
+    <w:bookmarkEnd w:id="26"/>
+    <w:bookmarkStart w:id="27" w:name="X6dbba4eb95812a90f20c800e44eb5a6a7358d51"/>
     <w:p>
       <w:pPr>
         <w:pStyle w:val="Heading3"/>
@@ -3570,8 +3595,8 @@
         <w:t xml:space="preserve">B2.</w:t>
       </w:r>
     </w:p>
-    <w:bookmarkEnd w:id="25"/>
-    <w:bookmarkStart w:id="26" w:name="Xb35b1f3f7dabbb428c448451ce7167cbe2cd4e6"/>
+    <w:bookmarkEnd w:id="27"/>
+    <w:bookmarkStart w:id="28" w:name="Xb35b1f3f7dabbb428c448451ce7167cbe2cd4e6"/>
     <w:p>
       <w:pPr>
         <w:pStyle w:val="Heading3"/>
@@ -3901,8 +3926,8 @@
         <w:t xml:space="preserve">— bump test count from 9 to 11.</w:t>
       </w:r>
     </w:p>
-    <w:bookmarkEnd w:id="26"/>
-    <w:bookmarkStart w:id="27" w:name="X2dea41730e11114ce2f1f24a9ac20830f0c6d8c"/>
+    <w:bookmarkEnd w:id="28"/>
+    <w:bookmarkStart w:id="29" w:name="X2dea41730e11114ce2f1f24a9ac20830f0c6d8c"/>
     <w:p>
       <w:pPr>
         <w:pStyle w:val="Heading3"/>
@@ -4228,8 +4253,8 @@
         <w:t xml:space="preserve">: B1 (CHAL-COVER-001), C1 (TMX-T5), C2 (TMX-T7), C3 (TMX-T8), D1 (TOPO-DISPATCH-001) moved to Fixed.md.</w:t>
       </w:r>
     </w:p>
-    <w:bookmarkEnd w:id="27"/>
-    <w:bookmarkStart w:id="29" w:name="Xa47a1f2e6aab857c5ebcc9727ef871a96653e0e"/>
+    <w:bookmarkEnd w:id="29"/>
+    <w:bookmarkStart w:id="31" w:name="Xa47a1f2e6aab857c5ebcc9727ef871a96653e0e"/>
     <w:p>
       <w:pPr>
         <w:pStyle w:val="Heading3"/>
@@ -5189,7 +5214,7 @@
       <w:r>
         <w:t xml:space="preserve"> </w:t>
       </w:r>
-      <w:hyperlink r:id="rId28">
+      <w:hyperlink r:id="rId30">
         <w:r>
           <w:rPr>
             <w:rStyle w:val="VerbatimChar"/>
@@ -7705,8 +7730,8 @@
         <w:t xml:space="preserve">itself is a §12.10 / §11.4.6 violation — opaque commit message, silent submodule mutation, no CONTINUATION update. Cannot rewrite history per §9 data safety; documenting here is the audit trail.</w:t>
       </w:r>
     </w:p>
-    <w:bookmarkEnd w:id="29"/>
-    <w:bookmarkStart w:id="30" w:name="X39a6c66e0be7f50e7d32ecd13d50cf753d128a7"/>
+    <w:bookmarkEnd w:id="31"/>
+    <w:bookmarkStart w:id="32" w:name="X39a6c66e0be7f50e7d32ecd13d50cf753d128a7"/>
     <w:p>
       <w:pPr>
         <w:pStyle w:val="Heading3"/>
@@ -8040,8 +8065,8 @@
         <w:t xml:space="preserve">§3.6: removed stale "remaining open" note.</w:t>
       </w:r>
     </w:p>
-    <w:bookmarkEnd w:id="30"/>
-    <w:bookmarkStart w:id="31" w:name="X2726eb1fde9d0d5c4232a8af5bb29bc2efcb6ea"/>
+    <w:bookmarkEnd w:id="32"/>
+    <w:bookmarkStart w:id="33" w:name="X2726eb1fde9d0d5c4232a8af5bb29bc2efcb6ea"/>
     <w:p>
       <w:pPr>
         <w:pStyle w:val="Heading3"/>
@@ -9016,8 +9041,8 @@
         <w:t xml:space="preserve">all work").</w:t>
       </w:r>
     </w:p>
-    <w:bookmarkEnd w:id="31"/>
-    <w:bookmarkStart w:id="32" w:name="X50530f0d3163508b53d4e1446abd0230469972a"/>
+    <w:bookmarkEnd w:id="33"/>
+    <w:bookmarkStart w:id="34" w:name="X50530f0d3163508b53d4e1446abd0230469972a"/>
     <w:p>
       <w:pPr>
         <w:pStyle w:val="Heading3"/>
@@ -9745,8 +9770,8 @@
         <w:t xml:space="preserve">headless).</w:t>
       </w:r>
     </w:p>
-    <w:bookmarkEnd w:id="32"/>
-    <w:bookmarkStart w:id="33" w:name="Xb6dc7ed3ec66a5d998e26a7e8534471ca2cc3e0"/>
+    <w:bookmarkEnd w:id="34"/>
+    <w:bookmarkStart w:id="35" w:name="Xb6dc7ed3ec66a5d998e26a7e8534471ca2cc3e0"/>
     <w:p>
       <w:pPr>
         <w:pStyle w:val="Heading3"/>
@@ -10186,8 +10211,8 @@
         <w:t xml:space="preserve">"Make sure we setup the new version once all done." directive.</w:t>
       </w:r>
     </w:p>
-    <w:bookmarkEnd w:id="33"/>
-    <w:bookmarkStart w:id="34" w:name="Xd3af410912ca3cafb170fb407cc411bb8aa2631"/>
+    <w:bookmarkEnd w:id="35"/>
+    <w:bookmarkStart w:id="36" w:name="Xd3af410912ca3cafb170fb407cc411bb8aa2631"/>
     <w:p>
       <w:pPr>
         <w:pStyle w:val="Heading3"/>
@@ -10610,8 +10635,8 @@
         <w:t xml:space="preserve">as deferred post-release smoke.</w:t>
       </w:r>
     </w:p>
-    <w:bookmarkEnd w:id="34"/>
-    <w:bookmarkStart w:id="35" w:name="Xd334663f66da9fbc338b039ddad8ed42ad07243"/>
+    <w:bookmarkEnd w:id="36"/>
+    <w:bookmarkStart w:id="37" w:name="Xd334663f66da9fbc338b039ddad8ed42ad07243"/>
     <w:p>
       <w:pPr>
         <w:pStyle w:val="Heading3"/>
@@ -11088,8 +11113,8 @@
         <w:t xml:space="preserve">preceded the tag; no spot-check shortcut).</w:t>
       </w:r>
     </w:p>
-    <w:bookmarkEnd w:id="35"/>
-    <w:bookmarkStart w:id="36" w:name="Xd55c57cd252c85ec7bdcd4b23e73cec6cfc2cd4"/>
+    <w:bookmarkEnd w:id="37"/>
+    <w:bookmarkStart w:id="38" w:name="Xd55c57cd252c85ec7bdcd4b23e73cec6cfc2cd4"/>
     <w:p>
       <w:pPr>
         <w:pStyle w:val="Heading3"/>
@@ -12160,8 +12185,8 @@
         <w:t xml:space="preserve">tests 09/13/14 alongside the Darwin branches running today.</w:t>
       </w:r>
     </w:p>
-    <w:bookmarkEnd w:id="36"/>
-    <w:bookmarkStart w:id="37" w:name="X572a5be484f72dd1209250eb21ec3b6cad7931d"/>
+    <w:bookmarkEnd w:id="38"/>
+    <w:bookmarkStart w:id="39" w:name="X572a5be484f72dd1209250eb21ec3b6cad7931d"/>
     <w:p>
       <w:pPr>
         <w:pStyle w:val="Heading3"/>
@@ -13109,8 +13134,8 @@
         <w:t xml:space="preserve">topology-correct), e2e 9/0/0.</w:t>
       </w:r>
     </w:p>
-    <w:bookmarkEnd w:id="37"/>
-    <w:bookmarkStart w:id="38" w:name="Xdc1f843cc4a7cc6c48cb008be32d2d72d9f426c"/>
+    <w:bookmarkEnd w:id="39"/>
+    <w:bookmarkStart w:id="40" w:name="Xdc1f843cc4a7cc6c48cb008be32d2d72d9f426c"/>
     <w:p>
       <w:pPr>
         <w:pStyle w:val="Heading3"/>
@@ -13719,9 +13744,9 @@
         <w:t xml:space="preserve">GREEN, suite PASS=13/0/SKIP=5, meta-test 18/0/6, e2e 9/0/0.</w:t>
       </w:r>
     </w:p>
-    <w:bookmarkEnd w:id="38"/>
-    <w:bookmarkEnd w:id="39"/>
-    <w:bookmarkStart w:id="40" w:name="Xf9daad60751079e769ca58715403a214307050f"/>
+    <w:bookmarkEnd w:id="40"/>
+    <w:bookmarkEnd w:id="41"/>
+    <w:bookmarkStart w:id="42" w:name="Xf9daad60751079e769ca58715403a214307050f"/>
     <w:p>
       <w:pPr>
         <w:pStyle w:val="Heading2"/>
@@ -14363,8 +14388,8 @@
         <w:t xml:space="preserve">(2026-05-07) — Initial vasic-digital/tmux: migrated from ATMOSphere project + per-session containerization plan + 8-test verification gate.</w:t>
       </w:r>
     </w:p>
-    <w:bookmarkEnd w:id="40"/>
-    <w:bookmarkStart w:id="41" w:name="X6eb44e94951e80621b9fe10f2f53b34d95aee13"/>
+    <w:bookmarkEnd w:id="42"/>
+    <w:bookmarkStart w:id="43" w:name="X6eb44e94951e80621b9fe10f2f53b34d95aee13"/>
     <w:p>
       <w:pPr>
         <w:pStyle w:val="Heading2"/>
@@ -14493,8 +14518,8 @@
         <w:t xml:space="preserve">Update this document in the SAME commit as the work itself (§12.10 invariant)</w:t>
       </w:r>
     </w:p>
-    <w:bookmarkEnd w:id="41"/>
-    <w:bookmarkEnd w:id="42"/>
+    <w:bookmarkEnd w:id="43"/>
+    <w:bookmarkEnd w:id="44"/>
     <w:sectPr>
       <w:footnotePr>
         <w:numRestart w:val="eachSect"/>

</xml_diff>